<commit_message>
Add KPI formulas and definitions to BRD
</commit_message>
<xml_diff>
--- a/BRD.docx
+++ b/BRD.docx
@@ -1467,34 +1467,1302 @@
         <w:pStyle w:val="Heading1"/>
       </w:pPr>
       <w:r>
-        <w:t>9. Key Metrics (KPI Catalog)</w:t>
+        <w:t>9. Key Metrics (KPI Catalog) — Definitions &amp; Formulas</w:t>
       </w:r>
     </w:p>
     <w:p>
       <w:r>
-        <w:t>Operational: Packages Submitted, Pending, Rejected, Cancellation Rate.</w:t>
+        <w:t>All sums apply the active filter context (date range, DMC, nationality, city, payment status, hotel class). Δ% denotes period-over-period change vs. the immediately preceding period of equal length.</w:t>
       </w:r>
     </w:p>
     <w:p>
+      <w:pPr>
+        <w:pStyle w:val="Heading2"/>
+      </w:pPr>
       <w:r>
-        <w:t>Visa &amp; Insurance: Visas Issued, Visa Pending, Insurance Policies Issued.</w:t>
+        <w:t>9.1 Universal Helpers</w:t>
       </w:r>
     </w:p>
     <w:p>
+      <w:pPr>
+        <w:pStyle w:val="ListBullet"/>
+      </w:pPr>
+      <w:r/>
       <w:r>
-        <w:t>Financial: Fees Collected (SAR), Total Package Value, Accommodation Value, Flight Value, Average Package Value, Revenue (Active DMCs).</w:t>
+        <w:rPr>
+          <w:b/>
+        </w:rPr>
+        <w:t>Period-over-period delta (%)</w:t>
+      </w:r>
+      <w:r>
+        <w:t xml:space="preserve">: </w:t>
+      </w:r>
+      <w:r>
+        <w:rPr>
+          <w:rFonts w:ascii="Consolas" w:hAnsi="Consolas"/>
+        </w:rPr>
+        <w:t>Δ% = (Current_Period_Value − Previous_Period_Value) / Previous_Period_Value × 100</w:t>
+      </w:r>
+      <w:r/>
+    </w:p>
+    <w:p>
+      <w:pPr>
+        <w:pStyle w:val="ListBullet"/>
+      </w:pPr>
+      <w:r/>
+      <w:r>
+        <w:rPr>
+          <w:b/>
+        </w:rPr>
+        <w:t>Filtered set P</w:t>
+      </w:r>
+      <w:r>
+        <w:t>: the set of packages matching all active filters.</w:t>
       </w:r>
     </w:p>
     <w:p>
+      <w:pPr>
+        <w:pStyle w:val="ListBullet"/>
+      </w:pPr>
+      <w:r/>
       <w:r>
-        <w:t>Partner: Active / Inactive DMCs, Completion Rate by DMC, Revenue Contribution.</w:t>
+        <w:rPr>
+          <w:b/>
+        </w:rPr>
+        <w:t>Filtered set T</w:t>
+      </w:r>
+      <w:r>
+        <w:t>: the set of travelers matching all active filters.</w:t>
       </w:r>
     </w:p>
     <w:p>
+      <w:pPr>
+        <w:pStyle w:val="Heading2"/>
+      </w:pPr>
       <w:r>
-        <w:t>Mobility: Travelers Entered, Exited, Currently In-Country, Overstay Alerts, Avg Cancellation Time.</w:t>
+        <w:t>9.2 Overview KPIs</w:t>
       </w:r>
     </w:p>
+    <w:tbl>
+      <w:tblPr>
+        <w:tblStyle w:val="LightGrid-Accent1"/>
+        <w:tblW w:type="auto" w:w="0"/>
+        <w:tblLook w:firstColumn="1" w:firstRow="1" w:lastColumn="0" w:lastRow="0" w:noHBand="0" w:noVBand="1" w:val="04A0"/>
+      </w:tblPr>
+      <w:tblGrid>
+        <w:gridCol w:w="4320"/>
+        <w:gridCol w:w="4320"/>
+      </w:tblGrid>
+      <w:tr>
+        <w:tc>
+          <w:tcPr>
+            <w:tcW w:type="dxa" w:w="4320"/>
+          </w:tcPr>
+          <w:p>
+            <w:r>
+              <w:rPr>
+                <w:b/>
+              </w:rPr>
+              <w:t>KPI</w:t>
+            </w:r>
+          </w:p>
+        </w:tc>
+        <w:tc>
+          <w:tcPr>
+            <w:tcW w:type="dxa" w:w="4320"/>
+          </w:tcPr>
+          <w:p>
+            <w:r>
+              <w:rPr>
+                <w:b/>
+              </w:rPr>
+              <w:t>Formula</w:t>
+            </w:r>
+          </w:p>
+        </w:tc>
+      </w:tr>
+      <w:tr>
+        <w:tc>
+          <w:tcPr>
+            <w:tcW w:type="dxa" w:w="4320"/>
+          </w:tcPr>
+          <w:p>
+            <w:r>
+              <w:t>Total Packages Submitted</w:t>
+            </w:r>
+          </w:p>
+        </w:tc>
+        <w:tc>
+          <w:tcPr>
+            <w:tcW w:type="dxa" w:w="4320"/>
+          </w:tcPr>
+          <w:p>
+            <w:r>
+              <w:t>`COUNT(p ∈ P WHERE p.status ≠ 'Draft')`</w:t>
+            </w:r>
+          </w:p>
+        </w:tc>
+      </w:tr>
+      <w:tr>
+        <w:tc>
+          <w:tcPr>
+            <w:tcW w:type="dxa" w:w="4320"/>
+          </w:tcPr>
+          <w:p>
+            <w:r>
+              <w:t>Total Visas Issued</w:t>
+            </w:r>
+          </w:p>
+        </w:tc>
+        <w:tc>
+          <w:tcPr>
+            <w:tcW w:type="dxa" w:w="4320"/>
+          </w:tcPr>
+          <w:p>
+            <w:r>
+              <w:t>`SUM(p.travelers WHERE p.visa_status = 'Issued')`</w:t>
+            </w:r>
+          </w:p>
+        </w:tc>
+      </w:tr>
+      <w:tr>
+        <w:tc>
+          <w:tcPr>
+            <w:tcW w:type="dxa" w:w="4320"/>
+          </w:tcPr>
+          <w:p>
+            <w:r>
+              <w:t>Total Fees Collected (SAR)</w:t>
+            </w:r>
+          </w:p>
+        </w:tc>
+        <w:tc>
+          <w:tcPr>
+            <w:tcW w:type="dxa" w:w="4320"/>
+          </w:tcPr>
+          <w:p>
+            <w:r>
+              <w:t>`SUM(p.gov_fees + p.processing_fees WHERE p.payment_status = 'Paid')`</w:t>
+            </w:r>
+          </w:p>
+        </w:tc>
+      </w:tr>
+      <w:tr>
+        <w:tc>
+          <w:tcPr>
+            <w:tcW w:type="dxa" w:w="4320"/>
+          </w:tcPr>
+          <w:p>
+            <w:r>
+              <w:t>Insurance Policies Issued</w:t>
+            </w:r>
+          </w:p>
+        </w:tc>
+        <w:tc>
+          <w:tcPr>
+            <w:tcW w:type="dxa" w:w="4320"/>
+          </w:tcPr>
+          <w:p>
+            <w:r>
+              <w:t>`COUNT(policy WHERE policy.status = 'Issued' AND policy.package_id ∈ P)`</w:t>
+            </w:r>
+          </w:p>
+        </w:tc>
+      </w:tr>
+      <w:tr>
+        <w:tc>
+          <w:tcPr>
+            <w:tcW w:type="dxa" w:w="4320"/>
+          </w:tcPr>
+          <w:p>
+            <w:r>
+              <w:t>Packages Pending</w:t>
+            </w:r>
+          </w:p>
+        </w:tc>
+        <w:tc>
+          <w:tcPr>
+            <w:tcW w:type="dxa" w:w="4320"/>
+          </w:tcPr>
+          <w:p>
+            <w:r>
+              <w:t>`COUNT(p ∈ P WHERE p.status ∈ {'Received','Validated','Fees Paid','Processing'})`</w:t>
+            </w:r>
+          </w:p>
+        </w:tc>
+      </w:tr>
+      <w:tr>
+        <w:tc>
+          <w:tcPr>
+            <w:tcW w:type="dxa" w:w="4320"/>
+          </w:tcPr>
+          <w:p>
+            <w:r>
+              <w:t>Packages Rejected</w:t>
+            </w:r>
+          </w:p>
+        </w:tc>
+        <w:tc>
+          <w:tcPr>
+            <w:tcW w:type="dxa" w:w="4320"/>
+          </w:tcPr>
+          <w:p>
+            <w:r>
+              <w:t>`COUNT(p ∈ P WHERE p.status = 'Rejected')`</w:t>
+            </w:r>
+          </w:p>
+        </w:tc>
+      </w:tr>
+      <w:tr>
+        <w:tc>
+          <w:tcPr>
+            <w:tcW w:type="dxa" w:w="4320"/>
+          </w:tcPr>
+          <w:p>
+            <w:r>
+              <w:t>Total DMCs</w:t>
+            </w:r>
+          </w:p>
+        </w:tc>
+        <w:tc>
+          <w:tcPr>
+            <w:tcW w:type="dxa" w:w="4320"/>
+          </w:tcPr>
+          <w:p>
+            <w:r>
+              <w:t>`COUNT(DISTINCT p.dmc_id WHERE p ∈ P)`</w:t>
+            </w:r>
+          </w:p>
+        </w:tc>
+      </w:tr>
+      <w:tr>
+        <w:tc>
+          <w:tcPr>
+            <w:tcW w:type="dxa" w:w="4320"/>
+          </w:tcPr>
+          <w:p>
+            <w:r>
+              <w:t>Cancellation Rate (%)</w:t>
+            </w:r>
+          </w:p>
+        </w:tc>
+        <w:tc>
+          <w:tcPr>
+            <w:tcW w:type="dxa" w:w="4320"/>
+          </w:tcPr>
+          <w:p>
+            <w:r>
+              <w:t>`(Packages_Cancelled / Total_Packages_Submitted) × 100`</w:t>
+            </w:r>
+          </w:p>
+        </w:tc>
+      </w:tr>
+    </w:tbl>
+    <w:p>
+      <w:pPr>
+        <w:pStyle w:val="Heading2"/>
+      </w:pPr>
+      <w:r>
+        <w:t>9.3 Packages &amp; Financials KPIs</w:t>
+      </w:r>
+    </w:p>
+    <w:tbl>
+      <w:tblPr>
+        <w:tblStyle w:val="LightGrid-Accent1"/>
+        <w:tblW w:type="auto" w:w="0"/>
+        <w:tblLook w:firstColumn="1" w:firstRow="1" w:lastColumn="0" w:lastRow="0" w:noHBand="0" w:noVBand="1" w:val="04A0"/>
+      </w:tblPr>
+      <w:tblGrid>
+        <w:gridCol w:w="4320"/>
+        <w:gridCol w:w="4320"/>
+      </w:tblGrid>
+      <w:tr>
+        <w:tc>
+          <w:tcPr>
+            <w:tcW w:type="dxa" w:w="4320"/>
+          </w:tcPr>
+          <w:p>
+            <w:r>
+              <w:rPr>
+                <w:b/>
+              </w:rPr>
+              <w:t>KPI</w:t>
+            </w:r>
+          </w:p>
+        </w:tc>
+        <w:tc>
+          <w:tcPr>
+            <w:tcW w:type="dxa" w:w="4320"/>
+          </w:tcPr>
+          <w:p>
+            <w:r>
+              <w:rPr>
+                <w:b/>
+              </w:rPr>
+              <w:t>Formula</w:t>
+            </w:r>
+          </w:p>
+        </w:tc>
+      </w:tr>
+      <w:tr>
+        <w:tc>
+          <w:tcPr>
+            <w:tcW w:type="dxa" w:w="4320"/>
+          </w:tcPr>
+          <w:p>
+            <w:r>
+              <w:t>Total Package Value (SAR)</w:t>
+            </w:r>
+          </w:p>
+        </w:tc>
+        <w:tc>
+          <w:tcPr>
+            <w:tcW w:type="dxa" w:w="4320"/>
+          </w:tcPr>
+          <w:p>
+            <w:r>
+              <w:t>`SUM(p.hotel_price + p.flight_price + p.visa_fees + p.processing_fees + p.insurance_fees + p.gov_fees)`</w:t>
+            </w:r>
+          </w:p>
+        </w:tc>
+      </w:tr>
+      <w:tr>
+        <w:tc>
+          <w:tcPr>
+            <w:tcW w:type="dxa" w:w="4320"/>
+          </w:tcPr>
+          <w:p>
+            <w:r>
+              <w:t>Accommodation Value (SAR)</w:t>
+            </w:r>
+          </w:p>
+        </w:tc>
+        <w:tc>
+          <w:tcPr>
+            <w:tcW w:type="dxa" w:w="4320"/>
+          </w:tcPr>
+          <w:p>
+            <w:r>
+              <w:t>`SUM(p.hotel_price)`</w:t>
+            </w:r>
+          </w:p>
+        </w:tc>
+      </w:tr>
+      <w:tr>
+        <w:tc>
+          <w:tcPr>
+            <w:tcW w:type="dxa" w:w="4320"/>
+          </w:tcPr>
+          <w:p>
+            <w:r>
+              <w:t>Flight Value (SAR)</w:t>
+            </w:r>
+          </w:p>
+        </w:tc>
+        <w:tc>
+          <w:tcPr>
+            <w:tcW w:type="dxa" w:w="4320"/>
+          </w:tcPr>
+          <w:p>
+            <w:r>
+              <w:t>`SUM(p.flight_price)`</w:t>
+            </w:r>
+          </w:p>
+        </w:tc>
+      </w:tr>
+      <w:tr>
+        <w:tc>
+          <w:tcPr>
+            <w:tcW w:type="dxa" w:w="4320"/>
+          </w:tcPr>
+          <w:p>
+            <w:r>
+              <w:t>Average Package Value (SAR)</w:t>
+            </w:r>
+          </w:p>
+        </w:tc>
+        <w:tc>
+          <w:tcPr>
+            <w:tcW w:type="dxa" w:w="4320"/>
+          </w:tcPr>
+          <w:p>
+            <w:r>
+              <w:t>`Total_Package_Value / COUNT(p ∈ P)`</w:t>
+            </w:r>
+          </w:p>
+        </w:tc>
+      </w:tr>
+      <w:tr>
+        <w:tc>
+          <w:tcPr>
+            <w:tcW w:type="dxa" w:w="4320"/>
+          </w:tcPr>
+          <w:p>
+            <w:r>
+              <w:t>Daily Submission Volume</w:t>
+            </w:r>
+          </w:p>
+        </w:tc>
+        <w:tc>
+          <w:tcPr>
+            <w:tcW w:type="dxa" w:w="4320"/>
+          </w:tcPr>
+          <w:p>
+            <w:r>
+              <w:t>`COUNT(p ∈ P WHERE DATE(p.submitted_at) = D)` for each day D in last 30 days</w:t>
+            </w:r>
+          </w:p>
+        </w:tc>
+      </w:tr>
+      <w:tr>
+        <w:tc>
+          <w:tcPr>
+            <w:tcW w:type="dxa" w:w="4320"/>
+          </w:tcPr>
+          <w:p>
+            <w:r>
+              <w:t>Revenue Trend (Monthly)</w:t>
+            </w:r>
+          </w:p>
+        </w:tc>
+        <w:tc>
+          <w:tcPr>
+            <w:tcW w:type="dxa" w:w="4320"/>
+          </w:tcPr>
+          <w:p>
+            <w:r>
+              <w:t>`SUM(p.gov_fees + p.processing_fees WHERE p.payment_status='Paid' AND MONTH(p.paid_at)=M)`</w:t>
+            </w:r>
+          </w:p>
+        </w:tc>
+      </w:tr>
+    </w:tbl>
+    <w:p>
+      <w:pPr>
+        <w:pStyle w:val="Heading2"/>
+      </w:pPr>
+      <w:r>
+        <w:t>9.4 Visa &amp; Insurance KPIs</w:t>
+      </w:r>
+    </w:p>
+    <w:tbl>
+      <w:tblPr>
+        <w:tblStyle w:val="LightGrid-Accent1"/>
+        <w:tblW w:type="auto" w:w="0"/>
+        <w:tblLook w:firstColumn="1" w:firstRow="1" w:lastColumn="0" w:lastRow="0" w:noHBand="0" w:noVBand="1" w:val="04A0"/>
+      </w:tblPr>
+      <w:tblGrid>
+        <w:gridCol w:w="4320"/>
+        <w:gridCol w:w="4320"/>
+      </w:tblGrid>
+      <w:tr>
+        <w:tc>
+          <w:tcPr>
+            <w:tcW w:type="dxa" w:w="4320"/>
+          </w:tcPr>
+          <w:p>
+            <w:r>
+              <w:rPr>
+                <w:b/>
+              </w:rPr>
+              <w:t>KPI</w:t>
+            </w:r>
+          </w:p>
+        </w:tc>
+        <w:tc>
+          <w:tcPr>
+            <w:tcW w:type="dxa" w:w="4320"/>
+          </w:tcPr>
+          <w:p>
+            <w:r>
+              <w:rPr>
+                <w:b/>
+              </w:rPr>
+              <w:t>Formula</w:t>
+            </w:r>
+          </w:p>
+        </w:tc>
+      </w:tr>
+      <w:tr>
+        <w:tc>
+          <w:tcPr>
+            <w:tcW w:type="dxa" w:w="4320"/>
+          </w:tcPr>
+          <w:p>
+            <w:r>
+              <w:t>Visas Issued (MOFA)</w:t>
+            </w:r>
+          </w:p>
+        </w:tc>
+        <w:tc>
+          <w:tcPr>
+            <w:tcW w:type="dxa" w:w="4320"/>
+          </w:tcPr>
+          <w:p>
+            <w:r>
+              <w:t>`COUNT(visa WHERE visa.status='Issued' AND visa.source='MOFA')`</w:t>
+            </w:r>
+          </w:p>
+        </w:tc>
+      </w:tr>
+      <w:tr>
+        <w:tc>
+          <w:tcPr>
+            <w:tcW w:type="dxa" w:w="4320"/>
+          </w:tcPr>
+          <w:p>
+            <w:r>
+              <w:t>Visa Pending</w:t>
+            </w:r>
+          </w:p>
+        </w:tc>
+        <w:tc>
+          <w:tcPr>
+            <w:tcW w:type="dxa" w:w="4320"/>
+          </w:tcPr>
+          <w:p>
+            <w:r>
+              <w:t>`COUNT(visa WHERE visa.status ∈ {'Submitted','Under Review','Awaiting Documents'})`</w:t>
+            </w:r>
+          </w:p>
+        </w:tc>
+      </w:tr>
+      <w:tr>
+        <w:tc>
+          <w:tcPr>
+            <w:tcW w:type="dxa" w:w="4320"/>
+          </w:tcPr>
+          <w:p>
+            <w:r>
+              <w:t>Insurance Policies Issued (IA)</w:t>
+            </w:r>
+          </w:p>
+        </w:tc>
+        <w:tc>
+          <w:tcPr>
+            <w:tcW w:type="dxa" w:w="4320"/>
+          </w:tcPr>
+          <w:p>
+            <w:r>
+              <w:t>`COUNT(policy WHERE policy.status='Issued' AND policy.source='IA')`</w:t>
+            </w:r>
+          </w:p>
+        </w:tc>
+      </w:tr>
+      <w:tr>
+        <w:tc>
+          <w:tcPr>
+            <w:tcW w:type="dxa" w:w="4320"/>
+          </w:tcPr>
+          <w:p>
+            <w:r>
+              <w:t>Validation Pass Rate (%)</w:t>
+            </w:r>
+          </w:p>
+        </w:tc>
+        <w:tc>
+          <w:tcPr>
+            <w:tcW w:type="dxa" w:w="4320"/>
+          </w:tcPr>
+          <w:p>
+            <w:r>
+              <w:t>`(Validated / (Validated + Rejected)) × 100`</w:t>
+            </w:r>
+          </w:p>
+        </w:tc>
+      </w:tr>
+      <w:tr>
+        <w:tc>
+          <w:tcPr>
+            <w:tcW w:type="dxa" w:w="4320"/>
+          </w:tcPr>
+          <w:p>
+            <w:r>
+              <w:t>Rejection Rate (%)</w:t>
+            </w:r>
+          </w:p>
+        </w:tc>
+        <w:tc>
+          <w:tcPr>
+            <w:tcW w:type="dxa" w:w="4320"/>
+          </w:tcPr>
+          <w:p>
+            <w:r>
+              <w:t>`Rejected / Total_Submitted × 100`</w:t>
+            </w:r>
+          </w:p>
+        </w:tc>
+      </w:tr>
+      <w:tr>
+        <w:tc>
+          <w:tcPr>
+            <w:tcW w:type="dxa" w:w="4320"/>
+          </w:tcPr>
+          <w:p>
+            <w:r>
+              <w:t>Government Fees Total (SAR)</w:t>
+            </w:r>
+          </w:p>
+        </w:tc>
+        <w:tc>
+          <w:tcPr>
+            <w:tcW w:type="dxa" w:w="4320"/>
+          </w:tcPr>
+          <w:p>
+            <w:r>
+              <w:t>`Σ_i (fee_unit_price_i × billable_units_i)` across all fee types</w:t>
+            </w:r>
+          </w:p>
+        </w:tc>
+      </w:tr>
+      <w:tr>
+        <w:tc>
+          <w:tcPr>
+            <w:tcW w:type="dxa" w:w="4320"/>
+          </w:tcPr>
+          <w:p>
+            <w:r>
+              <w:t>Visa Duration Distribution</w:t>
+            </w:r>
+          </w:p>
+        </w:tc>
+        <w:tc>
+          <w:tcPr>
+            <w:tcW w:type="dxa" w:w="4320"/>
+          </w:tcPr>
+          <w:p>
+            <w:r>
+              <w:t>For each bucket b: `COUNT(visa WHERE visa.duration_days ∈ b) / COUNT(visa) × 100`</w:t>
+            </w:r>
+          </w:p>
+        </w:tc>
+      </w:tr>
+    </w:tbl>
+    <w:p>
+      <w:pPr>
+        <w:pStyle w:val="Heading2"/>
+      </w:pPr>
+      <w:r>
+        <w:t>9.5 DMC Performance KPIs</w:t>
+      </w:r>
+    </w:p>
+    <w:tbl>
+      <w:tblPr>
+        <w:tblStyle w:val="LightGrid-Accent1"/>
+        <w:tblW w:type="auto" w:w="0"/>
+        <w:tblLook w:firstColumn="1" w:firstRow="1" w:lastColumn="0" w:lastRow="0" w:noHBand="0" w:noVBand="1" w:val="04A0"/>
+      </w:tblPr>
+      <w:tblGrid>
+        <w:gridCol w:w="4320"/>
+        <w:gridCol w:w="4320"/>
+      </w:tblGrid>
+      <w:tr>
+        <w:tc>
+          <w:tcPr>
+            <w:tcW w:type="dxa" w:w="4320"/>
+          </w:tcPr>
+          <w:p>
+            <w:r>
+              <w:rPr>
+                <w:b/>
+              </w:rPr>
+              <w:t>KPI</w:t>
+            </w:r>
+          </w:p>
+        </w:tc>
+        <w:tc>
+          <w:tcPr>
+            <w:tcW w:type="dxa" w:w="4320"/>
+          </w:tcPr>
+          <w:p>
+            <w:r>
+              <w:rPr>
+                <w:b/>
+              </w:rPr>
+              <w:t>Formula</w:t>
+            </w:r>
+          </w:p>
+        </w:tc>
+      </w:tr>
+      <w:tr>
+        <w:tc>
+          <w:tcPr>
+            <w:tcW w:type="dxa" w:w="4320"/>
+          </w:tcPr>
+          <w:p>
+            <w:r>
+              <w:t>Active DMCs</w:t>
+            </w:r>
+          </w:p>
+        </w:tc>
+        <w:tc>
+          <w:tcPr>
+            <w:tcW w:type="dxa" w:w="4320"/>
+          </w:tcPr>
+          <w:p>
+            <w:r>
+              <w:t>`COUNT(DISTINCT dmc WHERE dmc.status='Active' AND ∃ p ∈ P WHERE p.dmc=dmc within period)`</w:t>
+            </w:r>
+          </w:p>
+        </w:tc>
+      </w:tr>
+      <w:tr>
+        <w:tc>
+          <w:tcPr>
+            <w:tcW w:type="dxa" w:w="4320"/>
+          </w:tcPr>
+          <w:p>
+            <w:r>
+              <w:t>Inactive DMCs</w:t>
+            </w:r>
+          </w:p>
+        </w:tc>
+        <w:tc>
+          <w:tcPr>
+            <w:tcW w:type="dxa" w:w="4320"/>
+          </w:tcPr>
+          <w:p>
+            <w:r>
+              <w:t>`COUNT(dmc WHERE dmc.status='Inactive') OR (no submissions within period)`</w:t>
+            </w:r>
+          </w:p>
+        </w:tc>
+      </w:tr>
+      <w:tr>
+        <w:tc>
+          <w:tcPr>
+            <w:tcW w:type="dxa" w:w="4320"/>
+          </w:tcPr>
+          <w:p>
+            <w:r>
+              <w:t>Total Packages (Active DMCs)</w:t>
+            </w:r>
+          </w:p>
+        </w:tc>
+        <w:tc>
+          <w:tcPr>
+            <w:tcW w:type="dxa" w:w="4320"/>
+          </w:tcPr>
+          <w:p>
+            <w:r>
+              <w:t>`COUNT(p ∈ P WHERE p.dmc.status='Active')`</w:t>
+            </w:r>
+          </w:p>
+        </w:tc>
+      </w:tr>
+      <w:tr>
+        <w:tc>
+          <w:tcPr>
+            <w:tcW w:type="dxa" w:w="4320"/>
+          </w:tcPr>
+          <w:p>
+            <w:r>
+              <w:t>Revenue (Active DMCs) (SAR)</w:t>
+            </w:r>
+          </w:p>
+        </w:tc>
+        <w:tc>
+          <w:tcPr>
+            <w:tcW w:type="dxa" w:w="4320"/>
+          </w:tcPr>
+          <w:p>
+            <w:r>
+              <w:t>`SUM(p.gov_fees + p.processing_fees WHERE p.dmc.status='Active' AND p.payment_status='Paid')`</w:t>
+            </w:r>
+          </w:p>
+        </w:tc>
+      </w:tr>
+      <w:tr>
+        <w:tc>
+          <w:tcPr>
+            <w:tcW w:type="dxa" w:w="4320"/>
+          </w:tcPr>
+          <w:p>
+            <w:r>
+              <w:t>Completion Rate by DMC (%)</w:t>
+            </w:r>
+          </w:p>
+        </w:tc>
+        <w:tc>
+          <w:tcPr>
+            <w:tcW w:type="dxa" w:w="4320"/>
+          </w:tcPr>
+          <w:p>
+            <w:r>
+              <w:t>`(Packages_Completed_DMC / Total_Packages_DMC) × 100`</w:t>
+            </w:r>
+          </w:p>
+        </w:tc>
+      </w:tr>
+      <w:tr>
+        <w:tc>
+          <w:tcPr>
+            <w:tcW w:type="dxa" w:w="4320"/>
+          </w:tcPr>
+          <w:p>
+            <w:r>
+              <w:t>Revenue Contribution by DMC (%)</w:t>
+            </w:r>
+          </w:p>
+        </w:tc>
+        <w:tc>
+          <w:tcPr>
+            <w:tcW w:type="dxa" w:w="4320"/>
+          </w:tcPr>
+          <w:p>
+            <w:r>
+              <w:t>`Revenue_DMC / Total_Revenue × 100`</w:t>
+            </w:r>
+          </w:p>
+        </w:tc>
+      </w:tr>
+      <w:tr>
+        <w:tc>
+          <w:tcPr>
+            <w:tcW w:type="dxa" w:w="4320"/>
+          </w:tcPr>
+          <w:p>
+            <w:r>
+              <w:t>DMC Leaderboard Rank</w:t>
+            </w:r>
+          </w:p>
+        </w:tc>
+        <w:tc>
+          <w:tcPr>
+            <w:tcW w:type="dxa" w:w="4320"/>
+          </w:tcPr>
+          <w:p>
+            <w:r>
+              <w:t>`RANK() OVER (ORDER BY (Packages_Completed_DMC × w₁ + Revenue_DMC × w₂ + Completion_Rate_DMC × w₃) DESC)`</w:t>
+            </w:r>
+          </w:p>
+        </w:tc>
+      </w:tr>
+    </w:tbl>
+    <w:p>
+      <w:pPr>
+        <w:pStyle w:val="Heading2"/>
+      </w:pPr>
+      <w:r>
+        <w:t>9.6 Entry &amp; Cancellations KPIs</w:t>
+      </w:r>
+    </w:p>
+    <w:tbl>
+      <w:tblPr>
+        <w:tblStyle w:val="LightGrid-Accent1"/>
+        <w:tblW w:type="auto" w:w="0"/>
+        <w:tblLook w:firstColumn="1" w:firstRow="1" w:lastColumn="0" w:lastRow="0" w:noHBand="0" w:noVBand="1" w:val="04A0"/>
+      </w:tblPr>
+      <w:tblGrid>
+        <w:gridCol w:w="4320"/>
+        <w:gridCol w:w="4320"/>
+      </w:tblGrid>
+      <w:tr>
+        <w:tc>
+          <w:tcPr>
+            <w:tcW w:type="dxa" w:w="4320"/>
+          </w:tcPr>
+          <w:p>
+            <w:r>
+              <w:rPr>
+                <w:b/>
+              </w:rPr>
+              <w:t>KPI</w:t>
+            </w:r>
+          </w:p>
+        </w:tc>
+        <w:tc>
+          <w:tcPr>
+            <w:tcW w:type="dxa" w:w="4320"/>
+          </w:tcPr>
+          <w:p>
+            <w:r>
+              <w:rPr>
+                <w:b/>
+              </w:rPr>
+              <w:t>Formula</w:t>
+            </w:r>
+          </w:p>
+        </w:tc>
+      </w:tr>
+      <w:tr>
+        <w:tc>
+          <w:tcPr>
+            <w:tcW w:type="dxa" w:w="4320"/>
+          </w:tcPr>
+          <w:p>
+            <w:r>
+              <w:t>Travelers Entered KSA</w:t>
+            </w:r>
+          </w:p>
+        </w:tc>
+        <w:tc>
+          <w:tcPr>
+            <w:tcW w:type="dxa" w:w="4320"/>
+          </w:tcPr>
+          <w:p>
+            <w:r>
+              <w:t>`COUNT(traveler WHERE traveler.entry_timestamp BETWEEN period_start AND period_end)`</w:t>
+            </w:r>
+          </w:p>
+        </w:tc>
+      </w:tr>
+      <w:tr>
+        <w:tc>
+          <w:tcPr>
+            <w:tcW w:type="dxa" w:w="4320"/>
+          </w:tcPr>
+          <w:p>
+            <w:r>
+              <w:t>Travelers Exited KSA</w:t>
+            </w:r>
+          </w:p>
+        </w:tc>
+        <w:tc>
+          <w:tcPr>
+            <w:tcW w:type="dxa" w:w="4320"/>
+          </w:tcPr>
+          <w:p>
+            <w:r>
+              <w:t>`COUNT(traveler WHERE traveler.exit_timestamp BETWEEN period_start AND period_end)`</w:t>
+            </w:r>
+          </w:p>
+        </w:tc>
+      </w:tr>
+      <w:tr>
+        <w:tc>
+          <w:tcPr>
+            <w:tcW w:type="dxa" w:w="4320"/>
+          </w:tcPr>
+          <w:p>
+            <w:r>
+              <w:t>Currently In-Country</w:t>
+            </w:r>
+          </w:p>
+        </w:tc>
+        <w:tc>
+          <w:tcPr>
+            <w:tcW w:type="dxa" w:w="4320"/>
+          </w:tcPr>
+          <w:p>
+            <w:r>
+              <w:t>`Travelers_Entered_All_Time − Travelers_Exited_All_Time` (filtered to active visas)</w:t>
+            </w:r>
+          </w:p>
+        </w:tc>
+      </w:tr>
+      <w:tr>
+        <w:tc>
+          <w:tcPr>
+            <w:tcW w:type="dxa" w:w="4320"/>
+          </w:tcPr>
+          <w:p>
+            <w:r>
+              <w:t>Overstay Alerts</w:t>
+            </w:r>
+          </w:p>
+        </w:tc>
+        <w:tc>
+          <w:tcPr>
+            <w:tcW w:type="dxa" w:w="4320"/>
+          </w:tcPr>
+          <w:p>
+            <w:r>
+              <w:t>`COUNT(traveler WHERE traveler.exit_timestamp IS NULL AND TODAY &gt; traveler.visa_expiry_date)`</w:t>
+            </w:r>
+          </w:p>
+        </w:tc>
+      </w:tr>
+      <w:tr>
+        <w:tc>
+          <w:tcPr>
+            <w:tcW w:type="dxa" w:w="4320"/>
+          </w:tcPr>
+          <w:p>
+            <w:r>
+              <w:t>Package Cancellations</w:t>
+            </w:r>
+          </w:p>
+        </w:tc>
+        <w:tc>
+          <w:tcPr>
+            <w:tcW w:type="dxa" w:w="4320"/>
+          </w:tcPr>
+          <w:p>
+            <w:r>
+              <w:t>`COUNT(p ∈ P WHERE p.status='Cancelled')`</w:t>
+            </w:r>
+          </w:p>
+        </w:tc>
+      </w:tr>
+      <w:tr>
+        <w:tc>
+          <w:tcPr>
+            <w:tcW w:type="dxa" w:w="4320"/>
+          </w:tcPr>
+          <w:p>
+            <w:r>
+              <w:t>Traveler Cancellations</w:t>
+            </w:r>
+          </w:p>
+        </w:tc>
+        <w:tc>
+          <w:tcPr>
+            <w:tcW w:type="dxa" w:w="4320"/>
+          </w:tcPr>
+          <w:p>
+            <w:r>
+              <w:t>`SUM(p.travelers_cancelled WHERE p ∈ P)`</w:t>
+            </w:r>
+          </w:p>
+        </w:tc>
+      </w:tr>
+      <w:tr>
+        <w:tc>
+          <w:tcPr>
+            <w:tcW w:type="dxa" w:w="4320"/>
+          </w:tcPr>
+          <w:p>
+            <w:r>
+              <w:t>Overall Cancellation Rate (%)</w:t>
+            </w:r>
+          </w:p>
+        </w:tc>
+        <w:tc>
+          <w:tcPr>
+            <w:tcW w:type="dxa" w:w="4320"/>
+          </w:tcPr>
+          <w:p>
+            <w:r>
+              <w:t>`(Package_Cancellations / Total_Packages_Submitted) × 100`</w:t>
+            </w:r>
+          </w:p>
+        </w:tc>
+      </w:tr>
+      <w:tr>
+        <w:tc>
+          <w:tcPr>
+            <w:tcW w:type="dxa" w:w="4320"/>
+          </w:tcPr>
+          <w:p>
+            <w:r>
+              <w:t>Average Cancellation Time</w:t>
+            </w:r>
+          </w:p>
+        </w:tc>
+        <w:tc>
+          <w:tcPr>
+            <w:tcW w:type="dxa" w:w="4320"/>
+          </w:tcPr>
+          <w:p>
+            <w:r>
+              <w:t>`AVG(p.cancelled_at − p.submitted_at WHERE p.status='Cancelled')` (in hours or days)</w:t>
+            </w:r>
+          </w:p>
+        </w:tc>
+      </w:tr>
+      <w:tr>
+        <w:tc>
+          <w:tcPr>
+            <w:tcW w:type="dxa" w:w="4320"/>
+          </w:tcPr>
+          <w:p>
+            <w:r>
+              <w:t>Entry by Port (share %)</w:t>
+            </w:r>
+          </w:p>
+        </w:tc>
+        <w:tc>
+          <w:tcPr>
+            <w:tcW w:type="dxa" w:w="4320"/>
+          </w:tcPr>
+          <w:p>
+            <w:r>
+              <w:t>`COUNT(traveler WHERE traveler.port_of_entry = X) / Total_Travelers_Entered × 100`</w:t>
+            </w:r>
+          </w:p>
+        </w:tc>
+      </w:tr>
+      <w:tr>
+        <w:tc>
+          <w:tcPr>
+            <w:tcW w:type="dxa" w:w="4320"/>
+          </w:tcPr>
+          <w:p>
+            <w:r>
+              <w:t>Weekly Entry vs Exit</w:t>
+            </w:r>
+          </w:p>
+        </w:tc>
+        <w:tc>
+          <w:tcPr>
+            <w:tcW w:type="dxa" w:w="4320"/>
+          </w:tcPr>
+          <w:p>
+            <w:r>
+              <w:t>`COUNT(entry WHERE WEEK(entry.timestamp)=W)` and `COUNT(exit WHERE WEEK(exit.timestamp)=W)`</w:t>
+            </w:r>
+          </w:p>
+        </w:tc>
+      </w:tr>
+    </w:tbl>
+    <w:p>
+      <w:pPr>
+        <w:pStyle w:val="Heading2"/>
+      </w:pPr>
+      <w:r>
+        <w:t>9.7 Integration Health KPIs</w:t>
+      </w:r>
+    </w:p>
+    <w:tbl>
+      <w:tblPr>
+        <w:tblStyle w:val="LightGrid-Accent1"/>
+        <w:tblW w:type="auto" w:w="0"/>
+        <w:tblLook w:firstColumn="1" w:firstRow="1" w:lastColumn="0" w:lastRow="0" w:noHBand="0" w:noVBand="1" w:val="04A0"/>
+      </w:tblPr>
+      <w:tblGrid>
+        <w:gridCol w:w="4320"/>
+        <w:gridCol w:w="4320"/>
+      </w:tblGrid>
+      <w:tr>
+        <w:tc>
+          <w:tcPr>
+            <w:tcW w:type="dxa" w:w="4320"/>
+          </w:tcPr>
+          <w:p>
+            <w:r>
+              <w:rPr>
+                <w:b/>
+              </w:rPr>
+              <w:t>KPI</w:t>
+            </w:r>
+          </w:p>
+        </w:tc>
+        <w:tc>
+          <w:tcPr>
+            <w:tcW w:type="dxa" w:w="4320"/>
+          </w:tcPr>
+          <w:p>
+            <w:r>
+              <w:rPr>
+                <w:b/>
+              </w:rPr>
+              <w:t>Formula</w:t>
+            </w:r>
+          </w:p>
+        </w:tc>
+      </w:tr>
+      <w:tr>
+        <w:tc>
+          <w:tcPr>
+            <w:tcW w:type="dxa" w:w="4320"/>
+          </w:tcPr>
+          <w:p>
+            <w:r>
+              <w:t>MOFA Uptime (%)</w:t>
+            </w:r>
+          </w:p>
+        </w:tc>
+        <w:tc>
+          <w:tcPr>
+            <w:tcW w:type="dxa" w:w="4320"/>
+          </w:tcPr>
+          <w:p>
+            <w:r>
+              <w:t>`(Successful_API_Calls / Total_API_Calls) × 100` over rolling 24h</w:t>
+            </w:r>
+          </w:p>
+        </w:tc>
+      </w:tr>
+      <w:tr>
+        <w:tc>
+          <w:tcPr>
+            <w:tcW w:type="dxa" w:w="4320"/>
+          </w:tcPr>
+          <w:p>
+            <w:r>
+              <w:t>IA Uptime (%)</w:t>
+            </w:r>
+          </w:p>
+        </w:tc>
+        <w:tc>
+          <w:tcPr>
+            <w:tcW w:type="dxa" w:w="4320"/>
+          </w:tcPr>
+          <w:p>
+            <w:r>
+              <w:t>`(Successful_Policy_Issuances / Attempted_Policy_Issuances) × 100` over rolling 24h</w:t>
+            </w:r>
+          </w:p>
+        </w:tc>
+      </w:tr>
+      <w:tr>
+        <w:tc>
+          <w:tcPr>
+            <w:tcW w:type="dxa" w:w="4320"/>
+          </w:tcPr>
+          <w:p>
+            <w:r>
+              <w:t>VCC Card Health Score</w:t>
+            </w:r>
+          </w:p>
+        </w:tc>
+        <w:tc>
+          <w:tcPr>
+            <w:tcW w:type="dxa" w:w="4320"/>
+          </w:tcPr>
+          <w:p>
+            <w:r>
+              <w:t>`(Successful_Transactions / Total_Transactions) × 100 − (Declined_Rate × penalty)`</w:t>
+            </w:r>
+          </w:p>
+        </w:tc>
+      </w:tr>
+      <w:tr>
+        <w:tc>
+          <w:tcPr>
+            <w:tcW w:type="dxa" w:w="4320"/>
+          </w:tcPr>
+          <w:p>
+            <w:r>
+              <w:t>Average Visa Processing Time</w:t>
+            </w:r>
+          </w:p>
+        </w:tc>
+        <w:tc>
+          <w:tcPr>
+            <w:tcW w:type="dxa" w:w="4320"/>
+          </w:tcPr>
+          <w:p>
+            <w:r>
+              <w:t>`AVG(visa.issued_at − visa.submitted_at)` in hours</w:t>
+            </w:r>
+          </w:p>
+        </w:tc>
+      </w:tr>
+      <w:tr>
+        <w:tc>
+          <w:tcPr>
+            <w:tcW w:type="dxa" w:w="4320"/>
+          </w:tcPr>
+          <w:p>
+            <w:r>
+              <w:t>Average Insurance Issuance Time</w:t>
+            </w:r>
+          </w:p>
+        </w:tc>
+        <w:tc>
+          <w:tcPr>
+            <w:tcW w:type="dxa" w:w="4320"/>
+          </w:tcPr>
+          <w:p>
+            <w:r>
+              <w:t>`AVG(policy.issued_at − policy.requested_at)` in seconds/minutes</w:t>
+            </w:r>
+          </w:p>
+        </w:tc>
+      </w:tr>
+    </w:tbl>
     <w:p>
       <w:pPr>
         <w:pStyle w:val="Heading1"/>

</xml_diff>

<commit_message>
Update BRD with MTOTAeVisa database schema and field mappings
</commit_message>
<xml_diff>
--- a/BRD.docx
+++ b/BRD.docx
@@ -117,7 +117,7 @@
           </w:tcPr>
           <w:p>
             <w:r>
-              <w:t>1.0</w:t>
+              <w:t>1.1</w:t>
             </w:r>
           </w:p>
         </w:tc>
@@ -139,7 +139,7 @@
           </w:tcPr>
           <w:p>
             <w:r>
-              <w:t>2026-05-04</w:t>
+              <w:t>2026-05-05</w:t>
             </w:r>
           </w:p>
         </w:tc>
@@ -162,6 +162,131 @@
           <w:p>
             <w:r>
               <w:t>Draft</w:t>
+            </w:r>
+          </w:p>
+        </w:tc>
+      </w:tr>
+    </w:tbl>
+    <w:p>
+      <w:pPr>
+        <w:pStyle w:val="Heading2"/>
+      </w:pPr>
+      <w:r>
+        <w:t>Revision History</w:t>
+      </w:r>
+    </w:p>
+    <w:tbl>
+      <w:tblPr>
+        <w:tblStyle w:val="LightGrid-Accent1"/>
+        <w:tblW w:type="auto" w:w="0"/>
+        <w:tblLook w:firstColumn="1" w:firstRow="1" w:lastColumn="0" w:lastRow="0" w:noHBand="0" w:noVBand="1" w:val="04A0"/>
+      </w:tblPr>
+      <w:tblGrid>
+        <w:gridCol w:w="2880"/>
+        <w:gridCol w:w="2880"/>
+        <w:gridCol w:w="2880"/>
+      </w:tblGrid>
+      <w:tr>
+        <w:tc>
+          <w:tcPr>
+            <w:tcW w:type="dxa" w:w="2880"/>
+          </w:tcPr>
+          <w:p>
+            <w:r>
+              <w:rPr>
+                <w:b/>
+              </w:rPr>
+              <w:t>Version</w:t>
+            </w:r>
+          </w:p>
+        </w:tc>
+        <w:tc>
+          <w:tcPr>
+            <w:tcW w:type="dxa" w:w="2880"/>
+          </w:tcPr>
+          <w:p>
+            <w:r>
+              <w:rPr>
+                <w:b/>
+              </w:rPr>
+              <w:t>Date</w:t>
+            </w:r>
+          </w:p>
+        </w:tc>
+        <w:tc>
+          <w:tcPr>
+            <w:tcW w:type="dxa" w:w="2880"/>
+          </w:tcPr>
+          <w:p>
+            <w:r>
+              <w:rPr>
+                <w:b/>
+              </w:rPr>
+              <w:t>Change</w:t>
+            </w:r>
+          </w:p>
+        </w:tc>
+      </w:tr>
+      <w:tr>
+        <w:tc>
+          <w:tcPr>
+            <w:tcW w:type="dxa" w:w="2880"/>
+          </w:tcPr>
+          <w:p>
+            <w:r>
+              <w:t>1.0</w:t>
+            </w:r>
+          </w:p>
+        </w:tc>
+        <w:tc>
+          <w:tcPr>
+            <w:tcW w:type="dxa" w:w="2880"/>
+          </w:tcPr>
+          <w:p>
+            <w:r>
+              <w:t>2026-05-04</w:t>
+            </w:r>
+          </w:p>
+        </w:tc>
+        <w:tc>
+          <w:tcPr>
+            <w:tcW w:type="dxa" w:w="2880"/>
+          </w:tcPr>
+          <w:p>
+            <w:r>
+              <w:t>Initial BRD</w:t>
+            </w:r>
+          </w:p>
+        </w:tc>
+      </w:tr>
+      <w:tr>
+        <w:tc>
+          <w:tcPr>
+            <w:tcW w:type="dxa" w:w="2880"/>
+          </w:tcPr>
+          <w:p>
+            <w:r>
+              <w:t>1.1</w:t>
+            </w:r>
+          </w:p>
+        </w:tc>
+        <w:tc>
+          <w:tcPr>
+            <w:tcW w:type="dxa" w:w="2880"/>
+          </w:tcPr>
+          <w:p>
+            <w:r>
+              <w:t>2026-05-05</w:t>
+            </w:r>
+          </w:p>
+        </w:tc>
+        <w:tc>
+          <w:tcPr>
+            <w:tcW w:type="dxa" w:w="2880"/>
+          </w:tcPr>
+          <w:p>
+            <w:r>
+              <w:t>Added Section 8.1 (MTOTAeVisa Data Model) and KPI source-column mapping; aligned data sources with `MTOTAeVisa_DatabaseDetails.xlsx` (OTAEVisa_ESB, OTAEVisa_App_Attachments, OTAEVisa_ESB_Logs)</w:t>
             </w:r>
           </w:p>
         </w:tc>
@@ -1291,6 +1416,1367 @@
         <w:t>8. Data Sources &amp; Integrations</w:t>
       </w:r>
     </w:p>
+    <w:p>
+      <w:pPr>
+        <w:pStyle w:val="Heading2"/>
+      </w:pPr>
+      <w:r>
+        <w:t>8.1 MTOTAeVisa Authoritative Database</w:t>
+      </w:r>
+    </w:p>
+    <w:p>
+      <w:r>
+        <w:t xml:space="preserve">The dashboard is now bound to the </w:t>
+      </w:r>
+      <w:r>
+        <w:rPr>
+          <w:b/>
+        </w:rPr>
+        <w:t>MTOTAeVisa</w:t>
+      </w:r>
+      <w:r>
+        <w:t xml:space="preserve"> platform's three operational databases (per </w:t>
+      </w:r>
+      <w:r>
+        <w:rPr>
+          <w:rFonts w:ascii="Consolas" w:hAnsi="Consolas"/>
+        </w:rPr>
+        <w:t>MTOTAeVisa_DatabaseDetails.xlsx</w:t>
+      </w:r>
+      <w:r>
+        <w:t>):</w:t>
+      </w:r>
+    </w:p>
+    <w:tbl>
+      <w:tblPr>
+        <w:tblStyle w:val="LightGrid-Accent1"/>
+        <w:tblW w:type="auto" w:w="0"/>
+        <w:tblLook w:firstColumn="1" w:firstRow="1" w:lastColumn="0" w:lastRow="0" w:noHBand="0" w:noVBand="1" w:val="04A0"/>
+      </w:tblPr>
+      <w:tblGrid>
+        <w:gridCol w:w="2880"/>
+        <w:gridCol w:w="2880"/>
+        <w:gridCol w:w="2880"/>
+      </w:tblGrid>
+      <w:tr>
+        <w:tc>
+          <w:tcPr>
+            <w:tcW w:type="dxa" w:w="2880"/>
+          </w:tcPr>
+          <w:p>
+            <w:r>
+              <w:rPr>
+                <w:b/>
+              </w:rPr>
+              <w:t>Database</w:t>
+            </w:r>
+          </w:p>
+        </w:tc>
+        <w:tc>
+          <w:tcPr>
+            <w:tcW w:type="dxa" w:w="2880"/>
+          </w:tcPr>
+          <w:p>
+            <w:r>
+              <w:rPr>
+                <w:b/>
+              </w:rPr>
+              <w:t>Purpose</w:t>
+            </w:r>
+          </w:p>
+        </w:tc>
+        <w:tc>
+          <w:tcPr>
+            <w:tcW w:type="dxa" w:w="2880"/>
+          </w:tcPr>
+          <w:p>
+            <w:r>
+              <w:rPr>
+                <w:b/>
+              </w:rPr>
+              <w:t>Tables (count)</w:t>
+            </w:r>
+          </w:p>
+        </w:tc>
+      </w:tr>
+      <w:tr>
+        <w:tc>
+          <w:tcPr>
+            <w:tcW w:type="dxa" w:w="2880"/>
+          </w:tcPr>
+          <w:p>
+            <w:r>
+              <w:t>`OTAEVisa_ESB`</w:t>
+            </w:r>
+          </w:p>
+        </w:tc>
+        <w:tc>
+          <w:tcPr>
+            <w:tcW w:type="dxa" w:w="2880"/>
+          </w:tcPr>
+          <w:p>
+            <w:r>
+              <w:t>Core operational data: packages, visas, DMCs, payments, masters</w:t>
+            </w:r>
+          </w:p>
+        </w:tc>
+        <w:tc>
+          <w:tcPr>
+            <w:tcW w:type="dxa" w:w="2880"/>
+          </w:tcPr>
+          <w:p>
+            <w:r>
+              <w:t>50</w:t>
+            </w:r>
+          </w:p>
+        </w:tc>
+      </w:tr>
+      <w:tr>
+        <w:tc>
+          <w:tcPr>
+            <w:tcW w:type="dxa" w:w="2880"/>
+          </w:tcPr>
+          <w:p>
+            <w:r>
+              <w:t>`OTAEVisa_App_Attachments`</w:t>
+            </w:r>
+          </w:p>
+        </w:tc>
+        <w:tc>
+          <w:tcPr>
+            <w:tcW w:type="dxa" w:w="2880"/>
+          </w:tcPr>
+          <w:p>
+            <w:r>
+              <w:t>Document storage for visa applications</w:t>
+            </w:r>
+          </w:p>
+        </w:tc>
+        <w:tc>
+          <w:tcPr>
+            <w:tcW w:type="dxa" w:w="2880"/>
+          </w:tcPr>
+          <w:p>
+            <w:r>
+              <w:t>1 (`APPLICATION_ATTACHMENT`)</w:t>
+            </w:r>
+          </w:p>
+        </w:tc>
+      </w:tr>
+      <w:tr>
+        <w:tc>
+          <w:tcPr>
+            <w:tcW w:type="dxa" w:w="2880"/>
+          </w:tcPr>
+          <w:p>
+            <w:r>
+              <w:t>`OTAEVisa_ESB_Logs`</w:t>
+            </w:r>
+          </w:p>
+        </w:tc>
+        <w:tc>
+          <w:tcPr>
+            <w:tcW w:type="dxa" w:w="2880"/>
+          </w:tcPr>
+          <w:p>
+            <w:r>
+              <w:t>API access, transaction, and tourism package logs</w:t>
+            </w:r>
+          </w:p>
+        </w:tc>
+        <w:tc>
+          <w:tcPr>
+            <w:tcW w:type="dxa" w:w="2880"/>
+          </w:tcPr>
+          <w:p>
+            <w:r>
+              <w:t>3 (`OTA_ACCESS_LOG`, `OTA_TOURISMPACKAGELOG`, `TRANSACTIONLOG`)</w:t>
+            </w:r>
+          </w:p>
+        </w:tc>
+      </w:tr>
+    </w:tbl>
+    <w:p>
+      <w:r/>
+      <w:r>
+        <w:rPr>
+          <w:b/>
+        </w:rPr>
+        <w:t>Key tables in `OTAEVisa_ESB`</w:t>
+      </w:r>
+      <w:r>
+        <w:t xml:space="preserve"> (selected):</w:t>
+      </w:r>
+    </w:p>
+    <w:p>
+      <w:pPr>
+        <w:pStyle w:val="ListBullet"/>
+      </w:pPr>
+      <w:r>
+        <w:t xml:space="preserve">Package &amp; traveler: </w:t>
+      </w:r>
+      <w:r>
+        <w:rPr>
+          <w:rFonts w:ascii="Consolas" w:hAnsi="Consolas"/>
+        </w:rPr>
+        <w:t>PACKAGE_MASTER</w:t>
+      </w:r>
+      <w:r>
+        <w:t xml:space="preserve">, </w:t>
+      </w:r>
+      <w:r>
+        <w:rPr>
+          <w:rFonts w:ascii="Consolas" w:hAnsi="Consolas"/>
+        </w:rPr>
+        <w:t>VISA_APP_PERSONALDETAILS</w:t>
+      </w:r>
+      <w:r>
+        <w:t xml:space="preserve">, </w:t>
+      </w:r>
+      <w:r>
+        <w:rPr>
+          <w:rFonts w:ascii="Consolas" w:hAnsi="Consolas"/>
+        </w:rPr>
+        <w:t>VISA_APP_PASSPORTRAVEL</w:t>
+      </w:r>
+      <w:r>
+        <w:t xml:space="preserve">, </w:t>
+      </w:r>
+      <w:r>
+        <w:rPr>
+          <w:rFonts w:ascii="Consolas" w:hAnsi="Consolas"/>
+        </w:rPr>
+        <w:t>VISA_APP_PACKAGE_REQUEST_DATA</w:t>
+      </w:r>
+      <w:r>
+        <w:t xml:space="preserve">, </w:t>
+      </w:r>
+      <w:r>
+        <w:rPr>
+          <w:rFonts w:ascii="Consolas" w:hAnsi="Consolas"/>
+        </w:rPr>
+        <w:t>VISA_APP_ACCOMPANYING_SERVICE_DATA</w:t>
+      </w:r>
+      <w:r>
+        <w:t xml:space="preserve">, </w:t>
+      </w:r>
+      <w:r>
+        <w:rPr>
+          <w:rFonts w:ascii="Consolas" w:hAnsi="Consolas"/>
+        </w:rPr>
+        <w:t>DEPENDENTDATA</w:t>
+      </w:r>
+      <w:r/>
+    </w:p>
+    <w:p>
+      <w:pPr>
+        <w:pStyle w:val="ListBullet"/>
+      </w:pPr>
+      <w:r>
+        <w:t xml:space="preserve">Accommodation &amp; travel: </w:t>
+      </w:r>
+      <w:r>
+        <w:rPr>
+          <w:rFonts w:ascii="Consolas" w:hAnsi="Consolas"/>
+        </w:rPr>
+        <w:t>VISA_APP_ACCOMMODATION_DATA</w:t>
+      </w:r>
+      <w:r>
+        <w:t xml:space="preserve">, </w:t>
+      </w:r>
+      <w:r>
+        <w:rPr>
+          <w:rFonts w:ascii="Consolas" w:hAnsi="Consolas"/>
+        </w:rPr>
+        <w:t>VISA_APP_FLIGHT_DATA</w:t>
+      </w:r>
+      <w:r>
+        <w:t xml:space="preserve">, </w:t>
+      </w:r>
+      <w:r>
+        <w:rPr>
+          <w:rFonts w:ascii="Consolas" w:hAnsi="Consolas"/>
+        </w:rPr>
+        <w:t>HOTEL</w:t>
+      </w:r>
+      <w:r>
+        <w:t xml:space="preserve">, </w:t>
+      </w:r>
+      <w:r>
+        <w:rPr>
+          <w:rFonts w:ascii="Consolas" w:hAnsi="Consolas"/>
+        </w:rPr>
+        <w:t>DEPARTURE_CARRIER</w:t>
+      </w:r>
+      <w:r>
+        <w:t xml:space="preserve">, </w:t>
+      </w:r>
+      <w:r>
+        <w:rPr>
+          <w:rFonts w:ascii="Consolas" w:hAnsi="Consolas"/>
+        </w:rPr>
+        <w:t>ARRIVAL_CARRIER</w:t>
+      </w:r>
+      <w:r>
+        <w:t xml:space="preserve">, </w:t>
+      </w:r>
+      <w:r>
+        <w:rPr>
+          <w:rFonts w:ascii="Consolas" w:hAnsi="Consolas"/>
+        </w:rPr>
+        <w:t>TRANSPORTER</w:t>
+      </w:r>
+      <w:r/>
+    </w:p>
+    <w:p>
+      <w:pPr>
+        <w:pStyle w:val="ListBullet"/>
+      </w:pPr>
+      <w:r>
+        <w:t xml:space="preserve">Visa &amp; insurance: </w:t>
+      </w:r>
+      <w:r>
+        <w:rPr>
+          <w:rFonts w:ascii="Consolas" w:hAnsi="Consolas"/>
+        </w:rPr>
+        <w:t>VISA_APP_MOFA</w:t>
+      </w:r>
+      <w:r>
+        <w:t xml:space="preserve">, </w:t>
+      </w:r>
+      <w:r>
+        <w:rPr>
+          <w:rFonts w:ascii="Consolas" w:hAnsi="Consolas"/>
+        </w:rPr>
+        <w:t>VISA_APP_MOFA_QUESTIONNAIRE_DATA</w:t>
+      </w:r>
+      <w:r>
+        <w:t xml:space="preserve">, </w:t>
+      </w:r>
+      <w:r>
+        <w:rPr>
+          <w:rFonts w:ascii="Consolas" w:hAnsi="Consolas"/>
+        </w:rPr>
+        <w:t>VISA_APP_INSURANCE</w:t>
+      </w:r>
+      <w:r>
+        <w:t xml:space="preserve">, </w:t>
+      </w:r>
+      <w:r>
+        <w:rPr>
+          <w:rFonts w:ascii="Consolas" w:hAnsi="Consolas"/>
+        </w:rPr>
+        <w:t>VISA_APP_CANCELLATION</w:t>
+      </w:r>
+      <w:r/>
+    </w:p>
+    <w:p>
+      <w:pPr>
+        <w:pStyle w:val="ListBullet"/>
+      </w:pPr>
+      <w:r>
+        <w:t xml:space="preserve">Partners &amp; auth: </w:t>
+      </w:r>
+      <w:r>
+        <w:rPr>
+          <w:rFonts w:ascii="Consolas" w:hAnsi="Consolas"/>
+        </w:rPr>
+        <w:t>DMC</w:t>
+      </w:r>
+      <w:r>
+        <w:t xml:space="preserve">, </w:t>
+      </w:r>
+      <w:r>
+        <w:rPr>
+          <w:rFonts w:ascii="Consolas" w:hAnsi="Consolas"/>
+        </w:rPr>
+        <w:t>OTA_MASTER</w:t>
+      </w:r>
+      <w:r>
+        <w:t xml:space="preserve">, </w:t>
+      </w:r>
+      <w:r>
+        <w:rPr>
+          <w:rFonts w:ascii="Consolas" w:hAnsi="Consolas"/>
+        </w:rPr>
+        <w:t>OTA_DMC_AUTHORIZATION</w:t>
+      </w:r>
+      <w:r>
+        <w:t xml:space="preserve">, </w:t>
+      </w:r>
+      <w:r>
+        <w:rPr>
+          <w:rFonts w:ascii="Consolas" w:hAnsi="Consolas"/>
+        </w:rPr>
+        <w:t>OTA_DMC_CREDITCARDDETAILS</w:t>
+      </w:r>
+      <w:r>
+        <w:t xml:space="preserve">, </w:t>
+      </w:r>
+      <w:r>
+        <w:rPr>
+          <w:rFonts w:ascii="Consolas" w:hAnsi="Consolas"/>
+        </w:rPr>
+        <w:t>OTA_API_CREDENTIAL</w:t>
+      </w:r>
+      <w:r/>
+    </w:p>
+    <w:p>
+      <w:pPr>
+        <w:pStyle w:val="ListBullet"/>
+      </w:pPr>
+      <w:r>
+        <w:t xml:space="preserve">Payments: </w:t>
+      </w:r>
+      <w:r>
+        <w:rPr>
+          <w:rFonts w:ascii="Consolas" w:hAnsi="Consolas"/>
+        </w:rPr>
+        <w:t>TOURISM_PACKAGE_PAYMENT_REQUEST</w:t>
+      </w:r>
+      <w:r>
+        <w:t xml:space="preserve">, </w:t>
+      </w:r>
+      <w:r>
+        <w:rPr>
+          <w:rFonts w:ascii="Consolas" w:hAnsi="Consolas"/>
+        </w:rPr>
+        <w:t>TOURISM_PACKAGE_PAYMENT_CONFIRMATION</w:t>
+      </w:r>
+      <w:r>
+        <w:t xml:space="preserve">, </w:t>
+      </w:r>
+      <w:r>
+        <w:rPr>
+          <w:rFonts w:ascii="Consolas" w:hAnsi="Consolas"/>
+        </w:rPr>
+        <w:t>SERVICE_TYPE</w:t>
+      </w:r>
+      <w:r/>
+    </w:p>
+    <w:p>
+      <w:pPr>
+        <w:pStyle w:val="ListBullet"/>
+      </w:pPr>
+      <w:r>
+        <w:t xml:space="preserve">Reference / masters: </w:t>
+      </w:r>
+      <w:r>
+        <w:rPr>
+          <w:rFonts w:ascii="Consolas" w:hAnsi="Consolas"/>
+        </w:rPr>
+        <w:t>NATIONALITY</w:t>
+      </w:r>
+      <w:r>
+        <w:t xml:space="preserve">, </w:t>
+      </w:r>
+      <w:r>
+        <w:rPr>
+          <w:rFonts w:ascii="Consolas" w:hAnsi="Consolas"/>
+        </w:rPr>
+        <w:t>CITY</w:t>
+      </w:r>
+      <w:r>
+        <w:t xml:space="preserve">, </w:t>
+      </w:r>
+      <w:r>
+        <w:rPr>
+          <w:rFonts w:ascii="Consolas" w:hAnsi="Consolas"/>
+        </w:rPr>
+        <w:t>ENTRY_PORT</w:t>
+      </w:r>
+      <w:r>
+        <w:t xml:space="preserve">, </w:t>
+      </w:r>
+      <w:r>
+        <w:rPr>
+          <w:rFonts w:ascii="Consolas" w:hAnsi="Consolas"/>
+        </w:rPr>
+        <w:t>EXIT_PORT</w:t>
+      </w:r>
+      <w:r>
+        <w:t xml:space="preserve">, </w:t>
+      </w:r>
+      <w:r>
+        <w:rPr>
+          <w:rFonts w:ascii="Consolas" w:hAnsi="Consolas"/>
+        </w:rPr>
+        <w:t>EMBASSY_CODE</w:t>
+      </w:r>
+      <w:r>
+        <w:t xml:space="preserve">, </w:t>
+      </w:r>
+      <w:r>
+        <w:rPr>
+          <w:rFonts w:ascii="Consolas" w:hAnsi="Consolas"/>
+        </w:rPr>
+        <w:t>ADDRESS_COUNTRY</w:t>
+      </w:r>
+      <w:r>
+        <w:t xml:space="preserve">, </w:t>
+      </w:r>
+      <w:r>
+        <w:rPr>
+          <w:rFonts w:ascii="Consolas" w:hAnsi="Consolas"/>
+        </w:rPr>
+        <w:t>BIRTH_COUNTRY</w:t>
+      </w:r>
+      <w:r>
+        <w:t xml:space="preserve">, </w:t>
+      </w:r>
+      <w:r>
+        <w:rPr>
+          <w:rFonts w:ascii="Consolas" w:hAnsi="Consolas"/>
+        </w:rPr>
+        <w:t>ISSUE_COUNTRY</w:t>
+      </w:r>
+      <w:r>
+        <w:t xml:space="preserve">, </w:t>
+      </w:r>
+      <w:r>
+        <w:rPr>
+          <w:rFonts w:ascii="Consolas" w:hAnsi="Consolas"/>
+        </w:rPr>
+        <w:t>PASSPORT_TYPE</w:t>
+      </w:r>
+      <w:r>
+        <w:t xml:space="preserve">, </w:t>
+      </w:r>
+      <w:r>
+        <w:rPr>
+          <w:rFonts w:ascii="Consolas" w:hAnsi="Consolas"/>
+        </w:rPr>
+        <w:t>PASSPORT_ISSUE_COUNTRY</w:t>
+      </w:r>
+      <w:r>
+        <w:t xml:space="preserve">, </w:t>
+      </w:r>
+      <w:r>
+        <w:rPr>
+          <w:rFonts w:ascii="Consolas" w:hAnsi="Consolas"/>
+        </w:rPr>
+        <w:t>PASSPORT_ISSUE_PLACE</w:t>
+      </w:r>
+      <w:r>
+        <w:t xml:space="preserve">, </w:t>
+      </w:r>
+      <w:r>
+        <w:rPr>
+          <w:rFonts w:ascii="Consolas" w:hAnsi="Consolas"/>
+        </w:rPr>
+        <w:t>PURPOSE</w:t>
+      </w:r>
+      <w:r>
+        <w:t xml:space="preserve">, </w:t>
+      </w:r>
+      <w:r>
+        <w:rPr>
+          <w:rFonts w:ascii="Consolas" w:hAnsi="Consolas"/>
+        </w:rPr>
+        <w:t>RELIGION</w:t>
+      </w:r>
+      <w:r>
+        <w:t xml:space="preserve">, </w:t>
+      </w:r>
+      <w:r>
+        <w:rPr>
+          <w:rFonts w:ascii="Consolas" w:hAnsi="Consolas"/>
+        </w:rPr>
+        <w:t>GENDER</w:t>
+      </w:r>
+      <w:r>
+        <w:t xml:space="preserve">, </w:t>
+      </w:r>
+      <w:r>
+        <w:rPr>
+          <w:rFonts w:ascii="Consolas" w:hAnsi="Consolas"/>
+        </w:rPr>
+        <w:t>TITLE</w:t>
+      </w:r>
+      <w:r>
+        <w:t xml:space="preserve">, </w:t>
+      </w:r>
+      <w:r>
+        <w:rPr>
+          <w:rFonts w:ascii="Consolas" w:hAnsi="Consolas"/>
+        </w:rPr>
+        <w:t>SOCIAL_STATUS</w:t>
+      </w:r>
+      <w:r>
+        <w:t xml:space="preserve">, </w:t>
+      </w:r>
+      <w:r>
+        <w:rPr>
+          <w:rFonts w:ascii="Consolas" w:hAnsi="Consolas"/>
+        </w:rPr>
+        <w:t>COMPANION_TYPE</w:t>
+      </w:r>
+      <w:r>
+        <w:t xml:space="preserve">, </w:t>
+      </w:r>
+      <w:r>
+        <w:rPr>
+          <w:rFonts w:ascii="Consolas" w:hAnsi="Consolas"/>
+        </w:rPr>
+        <w:t>REQUEST_TYPE</w:t>
+      </w:r>
+      <w:r>
+        <w:t xml:space="preserve">, </w:t>
+      </w:r>
+      <w:r>
+        <w:rPr>
+          <w:rFonts w:ascii="Consolas" w:hAnsi="Consolas"/>
+        </w:rPr>
+        <w:t>DEGREE</w:t>
+      </w:r>
+      <w:r>
+        <w:t xml:space="preserve">, </w:t>
+      </w:r>
+      <w:r>
+        <w:rPr>
+          <w:rFonts w:ascii="Consolas" w:hAnsi="Consolas"/>
+        </w:rPr>
+        <w:t>API</w:t>
+      </w:r>
+      <w:r/>
+    </w:p>
+    <w:p>
+      <w:pPr>
+        <w:pStyle w:val="ListBullet"/>
+      </w:pPr>
+      <w:r>
+        <w:t xml:space="preserve">Settings &amp; policy: </w:t>
+      </w:r>
+      <w:r>
+        <w:rPr>
+          <w:rFonts w:ascii="Consolas" w:hAnsi="Consolas"/>
+        </w:rPr>
+        <w:t>ESB_SETTING</w:t>
+      </w:r>
+      <w:r>
+        <w:t xml:space="preserve">, </w:t>
+      </w:r>
+      <w:r>
+        <w:rPr>
+          <w:rFonts w:ascii="Consolas" w:hAnsi="Consolas"/>
+        </w:rPr>
+        <w:t>ESB_SITE_SETTINGS</w:t>
+      </w:r>
+      <w:r>
+        <w:t xml:space="preserve">, </w:t>
+      </w:r>
+      <w:r>
+        <w:rPr>
+          <w:rFonts w:ascii="Consolas" w:hAnsi="Consolas"/>
+        </w:rPr>
+        <w:t>DISCLAIMER</w:t>
+      </w:r>
+      <w:r>
+        <w:t xml:space="preserve">, </w:t>
+      </w:r>
+      <w:r>
+        <w:rPr>
+          <w:rFonts w:ascii="Consolas" w:hAnsi="Consolas"/>
+        </w:rPr>
+        <w:t>PRIVACYPOLICY_EN</w:t>
+      </w:r>
+      <w:r>
+        <w:t xml:space="preserve">, </w:t>
+      </w:r>
+      <w:r>
+        <w:rPr>
+          <w:rFonts w:ascii="Consolas" w:hAnsi="Consolas"/>
+        </w:rPr>
+        <w:t>PRIVACYPOLICY_AR</w:t>
+      </w:r>
+      <w:r/>
+    </w:p>
+    <w:p>
+      <w:pPr>
+        <w:pStyle w:val="ListBullet"/>
+      </w:pPr>
+      <w:r>
+        <w:t xml:space="preserve">Staging: </w:t>
+      </w:r>
+      <w:r>
+        <w:rPr>
+          <w:rFonts w:ascii="Consolas" w:hAnsi="Consolas"/>
+        </w:rPr>
+        <w:t>OTA_APPLICATION_PROCESSING_STG</w:t>
+      </w:r>
+      <w:r/>
+    </w:p>
+    <w:p>
+      <w:pPr>
+        <w:pStyle w:val="Heading2"/>
+      </w:pPr>
+      <w:r>
+        <w:t>8.2 Dashboard Field → Database Column Mapping</w:t>
+      </w:r>
+    </w:p>
+    <w:tbl>
+      <w:tblPr>
+        <w:tblStyle w:val="LightGrid-Accent1"/>
+        <w:tblW w:type="auto" w:w="0"/>
+        <w:tblLook w:firstColumn="1" w:firstRow="1" w:lastColumn="0" w:lastRow="0" w:noHBand="0" w:noVBand="1" w:val="04A0"/>
+      </w:tblPr>
+      <w:tblGrid>
+        <w:gridCol w:w="4320"/>
+        <w:gridCol w:w="4320"/>
+      </w:tblGrid>
+      <w:tr>
+        <w:tc>
+          <w:tcPr>
+            <w:tcW w:type="dxa" w:w="4320"/>
+          </w:tcPr>
+          <w:p>
+            <w:r>
+              <w:rPr>
+                <w:b/>
+              </w:rPr>
+              <w:t>Dashboard Object</w:t>
+            </w:r>
+          </w:p>
+        </w:tc>
+        <w:tc>
+          <w:tcPr>
+            <w:tcW w:type="dxa" w:w="4320"/>
+          </w:tcPr>
+          <w:p>
+            <w:r>
+              <w:rPr>
+                <w:b/>
+              </w:rPr>
+              <w:t>Source Table.Column</w:t>
+            </w:r>
+          </w:p>
+        </w:tc>
+      </w:tr>
+      <w:tr>
+        <w:tc>
+          <w:tcPr>
+            <w:tcW w:type="dxa" w:w="4320"/>
+          </w:tcPr>
+          <w:p>
+            <w:r>
+              <w:t>Package ID</w:t>
+            </w:r>
+          </w:p>
+        </w:tc>
+        <w:tc>
+          <w:tcPr>
+            <w:tcW w:type="dxa" w:w="4320"/>
+          </w:tcPr>
+          <w:p>
+            <w:r>
+              <w:t>`PACKAGE_MASTER.PACKAGE_ID`</w:t>
+            </w:r>
+          </w:p>
+        </w:tc>
+      </w:tr>
+      <w:tr>
+        <w:tc>
+          <w:tcPr>
+            <w:tcW w:type="dxa" w:w="4320"/>
+          </w:tcPr>
+          <w:p>
+            <w:r>
+              <w:t>Package Status</w:t>
+            </w:r>
+          </w:p>
+        </w:tc>
+        <w:tc>
+          <w:tcPr>
+            <w:tcW w:type="dxa" w:w="4320"/>
+          </w:tcPr>
+          <w:p>
+            <w:r>
+              <w:t>`PACKAGE_MASTER.PACKAGE_STATUS`</w:t>
+            </w:r>
+          </w:p>
+        </w:tc>
+      </w:tr>
+      <w:tr>
+        <w:tc>
+          <w:tcPr>
+            <w:tcW w:type="dxa" w:w="4320"/>
+          </w:tcPr>
+          <w:p>
+            <w:r>
+              <w:t>Total Travelers</w:t>
+            </w:r>
+          </w:p>
+        </w:tc>
+        <w:tc>
+          <w:tcPr>
+            <w:tcW w:type="dxa" w:w="4320"/>
+          </w:tcPr>
+          <w:p>
+            <w:r>
+              <w:t>`PACKAGE_MASTER.TOTAL_TRAVELERS_COUNT`</w:t>
+            </w:r>
+          </w:p>
+        </w:tc>
+      </w:tr>
+      <w:tr>
+        <w:tc>
+          <w:tcPr>
+            <w:tcW w:type="dxa" w:w="4320"/>
+          </w:tcPr>
+          <w:p>
+            <w:r>
+              <w:t>Total Package Price</w:t>
+            </w:r>
+          </w:p>
+        </w:tc>
+        <w:tc>
+          <w:tcPr>
+            <w:tcW w:type="dxa" w:w="4320"/>
+          </w:tcPr>
+          <w:p>
+            <w:r>
+              <w:t>`PACKAGE_MASTER.TOTAL_PACKAGE_PRICE`</w:t>
+            </w:r>
+          </w:p>
+        </w:tc>
+      </w:tr>
+      <w:tr>
+        <w:tc>
+          <w:tcPr>
+            <w:tcW w:type="dxa" w:w="4320"/>
+          </w:tcPr>
+          <w:p>
+            <w:r>
+              <w:t>Submission Timestamp</w:t>
+            </w:r>
+          </w:p>
+        </w:tc>
+        <w:tc>
+          <w:tcPr>
+            <w:tcW w:type="dxa" w:w="4320"/>
+          </w:tcPr>
+          <w:p>
+            <w:r>
+              <w:t>`PACKAGE_MASTER.CREATEDTIMESTAMP`</w:t>
+            </w:r>
+          </w:p>
+        </w:tc>
+      </w:tr>
+      <w:tr>
+        <w:tc>
+          <w:tcPr>
+            <w:tcW w:type="dxa" w:w="4320"/>
+          </w:tcPr>
+          <w:p>
+            <w:r>
+              <w:t>DMC</w:t>
+            </w:r>
+          </w:p>
+        </w:tc>
+        <w:tc>
+          <w:tcPr>
+            <w:tcW w:type="dxa" w:w="4320"/>
+          </w:tcPr>
+          <w:p>
+            <w:r>
+              <w:t>`DMC.DMC_NAME_EN` (via `PACKAGE_MASTER.DMC_RECORDID`)</w:t>
+            </w:r>
+          </w:p>
+        </w:tc>
+      </w:tr>
+      <w:tr>
+        <w:tc>
+          <w:tcPr>
+            <w:tcW w:type="dxa" w:w="4320"/>
+          </w:tcPr>
+          <w:p>
+            <w:r>
+              <w:t>DMC Status</w:t>
+            </w:r>
+          </w:p>
+        </w:tc>
+        <w:tc>
+          <w:tcPr>
+            <w:tcW w:type="dxa" w:w="4320"/>
+          </w:tcPr>
+          <w:p>
+            <w:r>
+              <w:t>`DMC.STATUS`, `DMC.IS_QUALIFIED`</w:t>
+            </w:r>
+          </w:p>
+        </w:tc>
+      </w:tr>
+      <w:tr>
+        <w:tc>
+          <w:tcPr>
+            <w:tcW w:type="dxa" w:w="4320"/>
+          </w:tcPr>
+          <w:p>
+            <w:r>
+              <w:t>Nationality</w:t>
+            </w:r>
+          </w:p>
+        </w:tc>
+        <w:tc>
+          <w:tcPr>
+            <w:tcW w:type="dxa" w:w="4320"/>
+          </w:tcPr>
+          <w:p>
+            <w:r>
+              <w:t>`VISA_APP_PERSONALDETAILS.NATIONALITY` → `NATIONALITY.NATIONALITY_NAME`</w:t>
+            </w:r>
+          </w:p>
+        </w:tc>
+      </w:tr>
+      <w:tr>
+        <w:tc>
+          <w:tcPr>
+            <w:tcW w:type="dxa" w:w="4320"/>
+          </w:tcPr>
+          <w:p>
+            <w:r>
+              <w:t>City of Stay</w:t>
+            </w:r>
+          </w:p>
+        </w:tc>
+        <w:tc>
+          <w:tcPr>
+            <w:tcW w:type="dxa" w:w="4320"/>
+          </w:tcPr>
+          <w:p>
+            <w:r>
+              <w:t>`VISA_APP_ACCOMMODATION_DATA.CITY` → `CITY.CITY_NAME`</w:t>
+            </w:r>
+          </w:p>
+        </w:tc>
+      </w:tr>
+      <w:tr>
+        <w:tc>
+          <w:tcPr>
+            <w:tcW w:type="dxa" w:w="4320"/>
+          </w:tcPr>
+          <w:p>
+            <w:r>
+              <w:t>Hotel Class (Star)</w:t>
+            </w:r>
+          </w:p>
+        </w:tc>
+        <w:tc>
+          <w:tcPr>
+            <w:tcW w:type="dxa" w:w="4320"/>
+          </w:tcPr>
+          <w:p>
+            <w:r>
+              <w:t>`VISA_APP_ACCOMMODATION_DATA.HOTEL_CLASSIFICATION`</w:t>
+            </w:r>
+          </w:p>
+        </w:tc>
+      </w:tr>
+      <w:tr>
+        <w:tc>
+          <w:tcPr>
+            <w:tcW w:type="dxa" w:w="4320"/>
+          </w:tcPr>
+          <w:p>
+            <w:r>
+              <w:t>Hotel Name</w:t>
+            </w:r>
+          </w:p>
+        </w:tc>
+        <w:tc>
+          <w:tcPr>
+            <w:tcW w:type="dxa" w:w="4320"/>
+          </w:tcPr>
+          <w:p>
+            <w:r>
+              <w:t>`HOTEL.HOTEL_NAME` (via `VISA_APP_ACCOMMODATION_DATA.LICENSE_NO`)</w:t>
+            </w:r>
+          </w:p>
+        </w:tc>
+      </w:tr>
+      <w:tr>
+        <w:tc>
+          <w:tcPr>
+            <w:tcW w:type="dxa" w:w="4320"/>
+          </w:tcPr>
+          <w:p>
+            <w:r>
+              <w:t>Hotel Price</w:t>
+            </w:r>
+          </w:p>
+        </w:tc>
+        <w:tc>
+          <w:tcPr>
+            <w:tcW w:type="dxa" w:w="4320"/>
+          </w:tcPr>
+          <w:p>
+            <w:r>
+              <w:t>`VISA_APP_ACCOMMODATION_DATA.HOTEL_PRICE`</w:t>
+            </w:r>
+          </w:p>
+        </w:tc>
+      </w:tr>
+      <w:tr>
+        <w:tc>
+          <w:tcPr>
+            <w:tcW w:type="dxa" w:w="4320"/>
+          </w:tcPr>
+          <w:p>
+            <w:r>
+              <w:t>Package Duration</w:t>
+            </w:r>
+          </w:p>
+        </w:tc>
+        <w:tc>
+          <w:tcPr>
+            <w:tcW w:type="dxa" w:w="4320"/>
+          </w:tcPr>
+          <w:p>
+            <w:r>
+              <w:t>`VISA_APP_PACKAGE_REQUEST_DATA.PACKAGE_DURATION`</w:t>
+            </w:r>
+          </w:p>
+        </w:tc>
+      </w:tr>
+      <w:tr>
+        <w:tc>
+          <w:tcPr>
+            <w:tcW w:type="dxa" w:w="4320"/>
+          </w:tcPr>
+          <w:p>
+            <w:r>
+              <w:t>Departure Carrier</w:t>
+            </w:r>
+          </w:p>
+        </w:tc>
+        <w:tc>
+          <w:tcPr>
+            <w:tcW w:type="dxa" w:w="4320"/>
+          </w:tcPr>
+          <w:p>
+            <w:r>
+              <w:t>`DEPARTURE_CARRIER.CARRIER_NAME`</w:t>
+            </w:r>
+          </w:p>
+        </w:tc>
+      </w:tr>
+      <w:tr>
+        <w:tc>
+          <w:tcPr>
+            <w:tcW w:type="dxa" w:w="4320"/>
+          </w:tcPr>
+          <w:p>
+            <w:r>
+              <w:t>Arrival Carrier</w:t>
+            </w:r>
+          </w:p>
+        </w:tc>
+        <w:tc>
+          <w:tcPr>
+            <w:tcW w:type="dxa" w:w="4320"/>
+          </w:tcPr>
+          <w:p>
+            <w:r>
+              <w:t>`ARRIVAL_CARRIER.CARRIER_NAME`</w:t>
+            </w:r>
+          </w:p>
+        </w:tc>
+      </w:tr>
+      <w:tr>
+        <w:tc>
+          <w:tcPr>
+            <w:tcW w:type="dxa" w:w="4320"/>
+          </w:tcPr>
+          <w:p>
+            <w:r>
+              <w:t>Flight Price</w:t>
+            </w:r>
+          </w:p>
+        </w:tc>
+        <w:tc>
+          <w:tcPr>
+            <w:tcW w:type="dxa" w:w="4320"/>
+          </w:tcPr>
+          <w:p>
+            <w:r>
+              <w:t>`VISA_APP_FLIGHT_DATA.FLIGHT_PRICE`</w:t>
+            </w:r>
+          </w:p>
+        </w:tc>
+      </w:tr>
+      <w:tr>
+        <w:tc>
+          <w:tcPr>
+            <w:tcW w:type="dxa" w:w="4320"/>
+          </w:tcPr>
+          <w:p>
+            <w:r>
+              <w:t>Visa Issuance Fee</w:t>
+            </w:r>
+          </w:p>
+        </w:tc>
+        <w:tc>
+          <w:tcPr>
+            <w:tcW w:type="dxa" w:w="4320"/>
+          </w:tcPr>
+          <w:p>
+            <w:r>
+              <w:t>`TOURISM_PACKAGE_PAYMENT_CONFIRMATION.AMOUNT` (SERVICE_TYPE = visa issuance)</w:t>
+            </w:r>
+          </w:p>
+        </w:tc>
+      </w:tr>
+      <w:tr>
+        <w:tc>
+          <w:tcPr>
+            <w:tcW w:type="dxa" w:w="4320"/>
+          </w:tcPr>
+          <w:p>
+            <w:r>
+              <w:t>Visa Processing Fee</w:t>
+            </w:r>
+          </w:p>
+        </w:tc>
+        <w:tc>
+          <w:tcPr>
+            <w:tcW w:type="dxa" w:w="4320"/>
+          </w:tcPr>
+          <w:p>
+            <w:r>
+              <w:t>`TOURISM_PACKAGE_PAYMENT_CONFIRMATION.AMOUNT` (SERVICE_TYPE = visa processing)</w:t>
+            </w:r>
+          </w:p>
+        </w:tc>
+      </w:tr>
+      <w:tr>
+        <w:tc>
+          <w:tcPr>
+            <w:tcW w:type="dxa" w:w="4320"/>
+          </w:tcPr>
+          <w:p>
+            <w:r>
+              <w:t>Insurance Fee</w:t>
+            </w:r>
+          </w:p>
+        </w:tc>
+        <w:tc>
+          <w:tcPr>
+            <w:tcW w:type="dxa" w:w="4320"/>
+          </w:tcPr>
+          <w:p>
+            <w:r>
+              <w:t>`TOURISM_PACKAGE_PAYMENT_CONFIRMATION.AMOUNT` (SERVICE_TYPE = insurance policy)</w:t>
+            </w:r>
+          </w:p>
+        </w:tc>
+      </w:tr>
+      <w:tr>
+        <w:tc>
+          <w:tcPr>
+            <w:tcW w:type="dxa" w:w="4320"/>
+          </w:tcPr>
+          <w:p>
+            <w:r>
+              <w:t>Insurance Provider</w:t>
+            </w:r>
+          </w:p>
+        </w:tc>
+        <w:tc>
+          <w:tcPr>
+            <w:tcW w:type="dxa" w:w="4320"/>
+          </w:tcPr>
+          <w:p>
+            <w:r>
+              <w:t>`VISA_APP_INSURANCE` provider field</w:t>
+            </w:r>
+          </w:p>
+        </w:tc>
+      </w:tr>
+      <w:tr>
+        <w:tc>
+          <w:tcPr>
+            <w:tcW w:type="dxa" w:w="4320"/>
+          </w:tcPr>
+          <w:p>
+            <w:r>
+              <w:t>Visa Status / Expiry</w:t>
+            </w:r>
+          </w:p>
+        </w:tc>
+        <w:tc>
+          <w:tcPr>
+            <w:tcW w:type="dxa" w:w="4320"/>
+          </w:tcPr>
+          <w:p>
+            <w:r>
+              <w:t>`VISA_APP_MOFA.VISA_USAGE_STATUS`, `VISA_APP_MOFA.VISA_EXPIRYDATE`</w:t>
+            </w:r>
+          </w:p>
+        </w:tc>
+      </w:tr>
+      <w:tr>
+        <w:tc>
+          <w:tcPr>
+            <w:tcW w:type="dxa" w:w="4320"/>
+          </w:tcPr>
+          <w:p>
+            <w:r>
+              <w:t>Validation Status</w:t>
+            </w:r>
+          </w:p>
+        </w:tc>
+        <w:tc>
+          <w:tcPr>
+            <w:tcW w:type="dxa" w:w="4320"/>
+          </w:tcPr>
+          <w:p>
+            <w:r>
+              <w:t>`PACKAGE_MASTER.VALIDATION_STATUS`, `OTA_APPLICATION_PROCESSING_STG.APP_STATUS`</w:t>
+            </w:r>
+          </w:p>
+        </w:tc>
+      </w:tr>
+      <w:tr>
+        <w:tc>
+          <w:tcPr>
+            <w:tcW w:type="dxa" w:w="4320"/>
+          </w:tcPr>
+          <w:p>
+            <w:r>
+              <w:t>Cancellation Reason</w:t>
+            </w:r>
+          </w:p>
+        </w:tc>
+        <w:tc>
+          <w:tcPr>
+            <w:tcW w:type="dxa" w:w="4320"/>
+          </w:tcPr>
+          <w:p>
+            <w:r>
+              <w:t>`VISA_APP_CANCELLATION.CANCELLATIONREASON`, `FE_CANCELLATION_STATUS`, `ERRORCODE`</w:t>
+            </w:r>
+          </w:p>
+        </w:tc>
+      </w:tr>
+      <w:tr>
+        <w:tc>
+          <w:tcPr>
+            <w:tcW w:type="dxa" w:w="4320"/>
+          </w:tcPr>
+          <w:p>
+            <w:r>
+              <w:t>Entry / Arrival Date</w:t>
+            </w:r>
+          </w:p>
+        </w:tc>
+        <w:tc>
+          <w:tcPr>
+            <w:tcW w:type="dxa" w:w="4320"/>
+          </w:tcPr>
+          <w:p>
+            <w:r>
+              <w:t>`VISA_APP_FLIGHT_DATA.ARRIVAL_FLIGHT_DATE`</w:t>
+            </w:r>
+          </w:p>
+        </w:tc>
+      </w:tr>
+      <w:tr>
+        <w:tc>
+          <w:tcPr>
+            <w:tcW w:type="dxa" w:w="4320"/>
+          </w:tcPr>
+          <w:p>
+            <w:r>
+              <w:t>Passport Number</w:t>
+            </w:r>
+          </w:p>
+        </w:tc>
+        <w:tc>
+          <w:tcPr>
+            <w:tcW w:type="dxa" w:w="4320"/>
+          </w:tcPr>
+          <w:p>
+            <w:r>
+              <w:t>`VISA_APP_PASSPORTRAVEL.PASSPORTNUMBER`</w:t>
+            </w:r>
+          </w:p>
+        </w:tc>
+      </w:tr>
+      <w:tr>
+        <w:tc>
+          <w:tcPr>
+            <w:tcW w:type="dxa" w:w="4320"/>
+          </w:tcPr>
+          <w:p>
+            <w:r>
+              <w:t>VCC Card Status / Expiry</w:t>
+            </w:r>
+          </w:p>
+        </w:tc>
+        <w:tc>
+          <w:tcPr>
+            <w:tcW w:type="dxa" w:w="4320"/>
+          </w:tcPr>
+          <w:p>
+            <w:r>
+              <w:t>`OTA_DMC_CREDITCARDDETAILS.STATUS`, `EXPIRY_DATE`, `EXPIRY_REMINDER_COUNT`</w:t>
+            </w:r>
+          </w:p>
+        </w:tc>
+      </w:tr>
+      <w:tr>
+        <w:tc>
+          <w:tcPr>
+            <w:tcW w:type="dxa" w:w="4320"/>
+          </w:tcPr>
+          <w:p>
+            <w:r>
+              <w:t>API Access Logs</w:t>
+            </w:r>
+          </w:p>
+        </w:tc>
+        <w:tc>
+          <w:tcPr>
+            <w:tcW w:type="dxa" w:w="4320"/>
+          </w:tcPr>
+          <w:p>
+            <w:r>
+              <w:t>`OTA_ACCESS_LOG`, `TRANSACTIONLOG`, `OTA_TOURISMPACKAGELOG`</w:t>
+            </w:r>
+          </w:p>
+        </w:tc>
+      </w:tr>
+      <w:tr>
+        <w:tc>
+          <w:tcPr>
+            <w:tcW w:type="dxa" w:w="4320"/>
+          </w:tcPr>
+          <w:p>
+            <w:r>
+              <w:t>Application Attachments</w:t>
+            </w:r>
+          </w:p>
+        </w:tc>
+        <w:tc>
+          <w:tcPr>
+            <w:tcW w:type="dxa" w:w="4320"/>
+          </w:tcPr>
+          <w:p>
+            <w:r>
+              <w:t>`APPLICATION_ATTACHMENT`</w:t>
+            </w:r>
+          </w:p>
+        </w:tc>
+      </w:tr>
+    </w:tbl>
+    <w:p>
+      <w:pPr>
+        <w:pStyle w:val="Heading2"/>
+      </w:pPr>
+      <w:r>
+        <w:t>8.3 External Integrations</w:t>
+      </w:r>
+    </w:p>
     <w:tbl>
       <w:tblPr>
         <w:tblStyle w:val="LightGrid-Accent1"/>
@@ -1346,7 +2832,7 @@
           </w:tcPr>
           <w:p>
             <w:r>
-              <w:t>Visa issuance status, visa duration, rejection reasons</w:t>
+              <w:t>Visa issuance status, visa duration, rejection reasons (mirrored to `VISA_APP_MOFA`)</w:t>
             </w:r>
           </w:p>
         </w:tc>
@@ -1368,7 +2854,7 @@
           </w:tcPr>
           <w:p>
             <w:r>
-              <w:t>Policy issuance, insurer mapping</w:t>
+              <w:t>Policy issuance, insurer mapping (mirrored to `VISA_APP_INSURANCE`)</w:t>
             </w:r>
           </w:p>
         </w:tc>
@@ -1390,7 +2876,7 @@
           </w:tcPr>
           <w:p>
             <w:r>
-              <w:t>Entry/exit records, overstay flags</w:t>
+              <w:t>Entry/exit records, overstay flags (consumed via `ENTRY_PORT`, `EXIT_PORT`, `VISA_APP_MOFA`)</w:t>
             </w:r>
           </w:p>
         </w:tc>
@@ -1412,7 +2898,7 @@
           </w:tcPr>
           <w:p>
             <w:r>
-              <w:t>Package submissions, hotel/flight pricing</w:t>
+              <w:t>Package submissions, hotel/flight pricing (`PACKAGE_MASTER`, `VISA_APP_*`)</w:t>
             </w:r>
           </w:p>
         </w:tc>
@@ -1434,7 +2920,7 @@
           </w:tcPr>
           <w:p>
             <w:r>
-              <w:t>Fee collection, payment status</w:t>
+              <w:t>Fee collection, payment status (`TOURISM_PACKAGE_PAYMENT_REQUEST/_CONFIRMATION`)</w:t>
             </w:r>
           </w:p>
         </w:tc>
@@ -1456,7 +2942,7 @@
           </w:tcPr>
           <w:p>
             <w:r>
-              <w:t>Virtual card transaction and health telemetry</w:t>
+              <w:t>Virtual card transaction and health telemetry (`OTA_DMC_CREDITCARDDETAILS`)</w:t>
             </w:r>
           </w:p>
         </w:tc>
@@ -1550,13 +3036,14 @@
         <w:tblLook w:firstColumn="1" w:firstRow="1" w:lastColumn="0" w:lastRow="0" w:noHBand="0" w:noVBand="1" w:val="04A0"/>
       </w:tblPr>
       <w:tblGrid>
-        <w:gridCol w:w="4320"/>
-        <w:gridCol w:w="4320"/>
+        <w:gridCol w:w="2880"/>
+        <w:gridCol w:w="2880"/>
+        <w:gridCol w:w="2880"/>
       </w:tblGrid>
       <w:tr>
         <w:tc>
           <w:tcPr>
-            <w:tcW w:type="dxa" w:w="4320"/>
+            <w:tcW w:type="dxa" w:w="2880"/>
           </w:tcPr>
           <w:p>
             <w:r>
@@ -1569,7 +3056,7 @@
         </w:tc>
         <w:tc>
           <w:tcPr>
-            <w:tcW w:type="dxa" w:w="4320"/>
+            <w:tcW w:type="dxa" w:w="2880"/>
           </w:tcPr>
           <w:p>
             <w:r>
@@ -1580,11 +3067,24 @@
             </w:r>
           </w:p>
         </w:tc>
+        <w:tc>
+          <w:tcPr>
+            <w:tcW w:type="dxa" w:w="2880"/>
+          </w:tcPr>
+          <w:p>
+            <w:r>
+              <w:rPr>
+                <w:b/>
+              </w:rPr>
+              <w:t>Source</w:t>
+            </w:r>
+          </w:p>
+        </w:tc>
       </w:tr>
       <w:tr>
         <w:tc>
           <w:tcPr>
-            <w:tcW w:type="dxa" w:w="4320"/>
+            <w:tcW w:type="dxa" w:w="2880"/>
           </w:tcPr>
           <w:p>
             <w:r>
@@ -1594,11 +3094,21 @@
         </w:tc>
         <w:tc>
           <w:tcPr>
-            <w:tcW w:type="dxa" w:w="4320"/>
+            <w:tcW w:type="dxa" w:w="2880"/>
           </w:tcPr>
           <w:p>
             <w:r>
-              <w:t>`COUNT(p ∈ P WHERE p.status ≠ 'Draft')`</w:t>
+              <w:t>`COUNT(PACKAGE_MASTER.PACKAGE_ID WHERE PACKAGE_STATUS ≠ 'Draft')`</w:t>
+            </w:r>
+          </w:p>
+        </w:tc>
+        <w:tc>
+          <w:tcPr>
+            <w:tcW w:type="dxa" w:w="2880"/>
+          </w:tcPr>
+          <w:p>
+            <w:r>
+              <w:t>`PACKAGE_MASTER`</w:t>
             </w:r>
           </w:p>
         </w:tc>
@@ -1606,7 +3116,7 @@
       <w:tr>
         <w:tc>
           <w:tcPr>
-            <w:tcW w:type="dxa" w:w="4320"/>
+            <w:tcW w:type="dxa" w:w="2880"/>
           </w:tcPr>
           <w:p>
             <w:r>
@@ -1616,11 +3126,21 @@
         </w:tc>
         <w:tc>
           <w:tcPr>
-            <w:tcW w:type="dxa" w:w="4320"/>
+            <w:tcW w:type="dxa" w:w="2880"/>
           </w:tcPr>
           <w:p>
             <w:r>
-              <w:t>`SUM(p.travelers WHERE p.visa_status = 'Issued')`</w:t>
+              <w:t>`COUNT(VISA_APP_MOFA WHERE VISA_USAGE_STATUS = 'Issued')`</w:t>
+            </w:r>
+          </w:p>
+        </w:tc>
+        <w:tc>
+          <w:tcPr>
+            <w:tcW w:type="dxa" w:w="2880"/>
+          </w:tcPr>
+          <w:p>
+            <w:r>
+              <w:t>`VISA_APP_MOFA`</w:t>
             </w:r>
           </w:p>
         </w:tc>
@@ -1628,7 +3148,7 @@
       <w:tr>
         <w:tc>
           <w:tcPr>
-            <w:tcW w:type="dxa" w:w="4320"/>
+            <w:tcW w:type="dxa" w:w="2880"/>
           </w:tcPr>
           <w:p>
             <w:r>
@@ -1638,11 +3158,21 @@
         </w:tc>
         <w:tc>
           <w:tcPr>
-            <w:tcW w:type="dxa" w:w="4320"/>
+            <w:tcW w:type="dxa" w:w="2880"/>
           </w:tcPr>
           <w:p>
             <w:r>
-              <w:t>`SUM(p.gov_fees + p.processing_fees WHERE p.payment_status = 'Paid')`</w:t>
+              <w:t>`SUM(TOURISM_PACKAGE_PAYMENT_CONFIRMATION.AMOUNT)`</w:t>
+            </w:r>
+          </w:p>
+        </w:tc>
+        <w:tc>
+          <w:tcPr>
+            <w:tcW w:type="dxa" w:w="2880"/>
+          </w:tcPr>
+          <w:p>
+            <w:r>
+              <w:t>`TOURISM_PACKAGE_PAYMENT_CONFIRMATION`</w:t>
             </w:r>
           </w:p>
         </w:tc>
@@ -1650,7 +3180,7 @@
       <w:tr>
         <w:tc>
           <w:tcPr>
-            <w:tcW w:type="dxa" w:w="4320"/>
+            <w:tcW w:type="dxa" w:w="2880"/>
           </w:tcPr>
           <w:p>
             <w:r>
@@ -1660,11 +3190,21 @@
         </w:tc>
         <w:tc>
           <w:tcPr>
-            <w:tcW w:type="dxa" w:w="4320"/>
+            <w:tcW w:type="dxa" w:w="2880"/>
           </w:tcPr>
           <w:p>
             <w:r>
-              <w:t>`COUNT(policy WHERE policy.status = 'Issued' AND policy.package_id ∈ P)`</w:t>
+              <w:t>`COUNT(VISA_APP_INSURANCE WHERE policy_status = 'Issued')`</w:t>
+            </w:r>
+          </w:p>
+        </w:tc>
+        <w:tc>
+          <w:tcPr>
+            <w:tcW w:type="dxa" w:w="2880"/>
+          </w:tcPr>
+          <w:p>
+            <w:r>
+              <w:t>`VISA_APP_INSURANCE`</w:t>
             </w:r>
           </w:p>
         </w:tc>
@@ -1672,7 +3212,7 @@
       <w:tr>
         <w:tc>
           <w:tcPr>
-            <w:tcW w:type="dxa" w:w="4320"/>
+            <w:tcW w:type="dxa" w:w="2880"/>
           </w:tcPr>
           <w:p>
             <w:r>
@@ -1682,11 +3222,21 @@
         </w:tc>
         <w:tc>
           <w:tcPr>
-            <w:tcW w:type="dxa" w:w="4320"/>
+            <w:tcW w:type="dxa" w:w="2880"/>
           </w:tcPr>
           <w:p>
             <w:r>
-              <w:t>`COUNT(p ∈ P WHERE p.status ∈ {'Received','Validated','Fees Paid','Processing'})`</w:t>
+              <w:t>`COUNT(PACKAGE_MASTER WHERE PACKAGE_STATUS ∈ {'Received','Validated','Fees Paid','Processing'})`</w:t>
+            </w:r>
+          </w:p>
+        </w:tc>
+        <w:tc>
+          <w:tcPr>
+            <w:tcW w:type="dxa" w:w="2880"/>
+          </w:tcPr>
+          <w:p>
+            <w:r>
+              <w:t>`PACKAGE_MASTER`</w:t>
             </w:r>
           </w:p>
         </w:tc>
@@ -1694,7 +3244,7 @@
       <w:tr>
         <w:tc>
           <w:tcPr>
-            <w:tcW w:type="dxa" w:w="4320"/>
+            <w:tcW w:type="dxa" w:w="2880"/>
           </w:tcPr>
           <w:p>
             <w:r>
@@ -1704,11 +3254,21 @@
         </w:tc>
         <w:tc>
           <w:tcPr>
-            <w:tcW w:type="dxa" w:w="4320"/>
+            <w:tcW w:type="dxa" w:w="2880"/>
           </w:tcPr>
           <w:p>
             <w:r>
-              <w:t>`COUNT(p ∈ P WHERE p.status = 'Rejected')`</w:t>
+              <w:t>`COUNT(PACKAGE_MASTER WHERE PACKAGE_STATUS = 'Rejected')`</w:t>
+            </w:r>
+          </w:p>
+        </w:tc>
+        <w:tc>
+          <w:tcPr>
+            <w:tcW w:type="dxa" w:w="2880"/>
+          </w:tcPr>
+          <w:p>
+            <w:r>
+              <w:t>`PACKAGE_MASTER`</w:t>
             </w:r>
           </w:p>
         </w:tc>
@@ -1716,7 +3276,7 @@
       <w:tr>
         <w:tc>
           <w:tcPr>
-            <w:tcW w:type="dxa" w:w="4320"/>
+            <w:tcW w:type="dxa" w:w="2880"/>
           </w:tcPr>
           <w:p>
             <w:r>
@@ -1726,11 +3286,21 @@
         </w:tc>
         <w:tc>
           <w:tcPr>
-            <w:tcW w:type="dxa" w:w="4320"/>
+            <w:tcW w:type="dxa" w:w="2880"/>
           </w:tcPr>
           <w:p>
             <w:r>
-              <w:t>`COUNT(DISTINCT p.dmc_id WHERE p ∈ P)`</w:t>
+              <w:t>`COUNT(DISTINCT PACKAGE_MASTER.DMC_RECORDID)`</w:t>
+            </w:r>
+          </w:p>
+        </w:tc>
+        <w:tc>
+          <w:tcPr>
+            <w:tcW w:type="dxa" w:w="2880"/>
+          </w:tcPr>
+          <w:p>
+            <w:r>
+              <w:t>`PACKAGE_MASTER ⨝ DMC`</w:t>
             </w:r>
           </w:p>
         </w:tc>
@@ -1738,7 +3308,7 @@
       <w:tr>
         <w:tc>
           <w:tcPr>
-            <w:tcW w:type="dxa" w:w="4320"/>
+            <w:tcW w:type="dxa" w:w="2880"/>
           </w:tcPr>
           <w:p>
             <w:r>
@@ -1748,11 +3318,21 @@
         </w:tc>
         <w:tc>
           <w:tcPr>
-            <w:tcW w:type="dxa" w:w="4320"/>
+            <w:tcW w:type="dxa" w:w="2880"/>
           </w:tcPr>
           <w:p>
             <w:r>
-              <w:t>`(Packages_Cancelled / Total_Packages_Submitted) × 100`</w:t>
+              <w:t>`COUNT(VISA_APP_CANCELLATION) / COUNT(PACKAGE_MASTER) × 100`</w:t>
+            </w:r>
+          </w:p>
+        </w:tc>
+        <w:tc>
+          <w:tcPr>
+            <w:tcW w:type="dxa" w:w="2880"/>
+          </w:tcPr>
+          <w:p>
+            <w:r>
+              <w:t>`VISA_APP_CANCELLATION`</w:t>
             </w:r>
           </w:p>
         </w:tc>

</xml_diff>